<commit_message>
feat: add editable code112 project templates
Co-Authored-By: Devin AI <158243242+devin-ai-integration[bot]@users.noreply.github.com>
</commit_message>
<xml_diff>
--- a/templates/docx/inventory_act/appendix_template.docx
+++ b/templates/docx/inventory_act/appendix_template.docx
@@ -166,63 +166,34 @@
               <w:spacing w:after="0" w:line="240" w:lineRule="auto"/>
               <w:rPr>
                 <w:rFonts w:ascii="Arial CYR" w:eastAsia="Times New Roman" w:hAnsi="Arial CYR" w:cs="Arial CYR"/>
-                <w:sz w:val="20"/>
-                <w:szCs w:val="20"/>
-                <w:lang w:eastAsia="ru-RU"/>
-              </w:rPr>
-            </w:pPr>
-            <w:r>
-              <w:rPr>
-                <w:rFonts w:ascii="Times New Roman" w:eastAsia="Times New Roman" w:hAnsi="Times New Roman"/>
-                <w:lang w:eastAsia="ru-RU"/>
-              </w:rPr>
-              <w:t>Приложение</w:t>
-            </w:r>
-            <w:r>
-              <w:rPr>
-                <w:rFonts w:ascii="Times New Roman" w:eastAsia="Times New Roman" w:hAnsi="Times New Roman"/>
-                <w:lang w:eastAsia="ru-RU"/>
-              </w:rPr>
-              <w:t xml:space="preserve"> </w:t>
-            </w:r>
-            <w:r>
-              <w:rPr>
-                <w:rFonts w:ascii="Times New Roman" w:eastAsia="Times New Roman" w:hAnsi="Times New Roman"/>
-                <w:sz w:val="20"/>
-                <w:szCs w:val="20"/>
-                <w:lang w:eastAsia="ru-RU"/>
-              </w:rPr>
-              <w:t>к акту инвент</w:t>
-            </w:r>
-            <w:r>
-              <w:rPr>
-                <w:rFonts w:ascii="Times New Roman" w:eastAsia="Times New Roman" w:hAnsi="Times New Roman"/>
-                <w:sz w:val="20"/>
-                <w:szCs w:val="20"/>
-                <w:lang w:eastAsia="ru-RU"/>
-              </w:rPr>
-              <w:t xml:space="preserve">аризации отходов производства </w:t>
-            </w:r>
-            <w:r>
+                <w:lang w:eastAsia="ru-RU"/>
+              </w:rPr>
+            </w:pPr>
+            <w:r>
+              <w:rPr>
+                <w:rFonts w:ascii="Times New Roman" w:eastAsia="Times New Roman" w:hAnsi="Times New Roman"/>
+                <w:lang w:eastAsia="ru-RU"/>
+              </w:rPr>
+              <w:t xml:space="preserve">Приложение к акту инвентаризации отходов производства </w:t>
+            </w:r>
+            <w:r>
+              <w:rPr>
+                <w:rFonts w:ascii="Times New Roman" w:hAnsi="Times New Roman"/>
+              </w:rPr>
               <w:t>[</w:t>
             </w:r>
             <w:proofErr w:type="spellStart"/>
             <w:r>
               <w:rPr>
-                <w:sz w:val="16"/>
-                <w:szCs w:val="16"/>
-              </w:rPr>
-              <w:t>д</w:t>
-            </w:r>
-            <w:r>
-              <w:rPr>
-                <w:sz w:val="16"/>
-                <w:szCs w:val="16"/>
-              </w:rPr>
-              <w:t>ата_акта</w:t>
+                <w:rFonts w:ascii="Times New Roman" w:hAnsi="Times New Roman"/>
+              </w:rPr>
+              <w:t>дата_акта</w:t>
             </w:r>
             <w:proofErr w:type="spellEnd"/>
             <w:r>
+              <w:rPr>
+                <w:rFonts w:ascii="Times New Roman" w:hAnsi="Times New Roman"/>
+              </w:rPr>
               <w:t>]</w:t>
             </w:r>
           </w:p>
@@ -415,7 +386,7 @@
             <w:tcBorders>
               <w:top w:val="nil"/>
               <w:left w:val="nil"/>
-              <w:bottom w:val="nil"/>
+              <w:bottom w:val="single" w:sz="4" w:space="0" w:color="auto"/>
               <w:right w:val="nil"/>
             </w:tcBorders>
             <w:noWrap/>
@@ -432,30 +403,33 @@
                 <w:sz w:val="24"/>
                 <w:szCs w:val="24"/>
                 <w:highlight w:val="yellow"/>
-                <w:u w:val="single"/>
-                <w:lang w:eastAsia="ru-RU"/>
-              </w:rPr>
-            </w:pPr>
-            <w:r>
+                <w:lang w:eastAsia="ru-RU"/>
+              </w:rPr>
+            </w:pPr>
+            <w:r>
+              <w:rPr>
+                <w:rFonts w:ascii="Times New Roman" w:hAnsi="Times New Roman"/>
+                <w:sz w:val="24"/>
+                <w:szCs w:val="24"/>
+              </w:rPr>
               <w:t>[</w:t>
             </w:r>
             <w:proofErr w:type="spellStart"/>
             <w:r>
               <w:rPr>
-                <w:sz w:val="16"/>
-                <w:szCs w:val="16"/>
-              </w:rPr>
-              <w:t>н</w:t>
-            </w:r>
-            <w:r>
-              <w:rPr>
-                <w:sz w:val="16"/>
-                <w:szCs w:val="16"/>
-              </w:rPr>
-              <w:t>азвание_организации</w:t>
+                <w:rFonts w:ascii="Times New Roman" w:hAnsi="Times New Roman"/>
+                <w:sz w:val="24"/>
+                <w:szCs w:val="24"/>
+              </w:rPr>
+              <w:t>название_организации</w:t>
             </w:r>
             <w:proofErr w:type="spellEnd"/>
             <w:r>
+              <w:rPr>
+                <w:rFonts w:ascii="Times New Roman" w:hAnsi="Times New Roman"/>
+                <w:sz w:val="24"/>
+                <w:szCs w:val="24"/>
+              </w:rPr>
               <w:t>]</w:t>
             </w:r>
           </w:p>
@@ -495,7 +469,7 @@
           <w:tcPr>
             <w:tcW w:w="821" w:type="dxa"/>
             <w:tcBorders>
-              <w:top w:val="nil"/>
+              <w:top w:val="single" w:sz="4" w:space="0" w:color="auto"/>
               <w:left w:val="nil"/>
               <w:bottom w:val="single" w:sz="8" w:space="0" w:color="auto"/>
               <w:right w:val="nil"/>
@@ -517,7 +491,7 @@
             <w:tcW w:w="14373" w:type="dxa"/>
             <w:gridSpan w:val="11"/>
             <w:tcBorders>
-              <w:top w:val="nil"/>
+              <w:top w:val="single" w:sz="4" w:space="0" w:color="auto"/>
               <w:left w:val="nil"/>
               <w:bottom w:val="single" w:sz="8" w:space="0" w:color="auto"/>
               <w:right w:val="nil"/>
@@ -531,12 +505,16 @@
               <w:jc w:val="center"/>
               <w:rPr>
                 <w:rFonts w:ascii="Times New Roman" w:eastAsia="Times New Roman" w:hAnsi="Times New Roman"/>
-                <w:lang w:eastAsia="ru-RU"/>
-              </w:rPr>
-            </w:pPr>
-            <w:r>
-              <w:rPr>
-                <w:rFonts w:ascii="Times New Roman" w:eastAsia="Times New Roman" w:hAnsi="Times New Roman"/>
+                <w:sz w:val="20"/>
+                <w:szCs w:val="20"/>
+                <w:lang w:eastAsia="ru-RU"/>
+              </w:rPr>
+            </w:pPr>
+            <w:r>
+              <w:rPr>
+                <w:rFonts w:ascii="Times New Roman" w:eastAsia="Times New Roman" w:hAnsi="Times New Roman"/>
+                <w:sz w:val="20"/>
+                <w:szCs w:val="20"/>
                 <w:lang w:eastAsia="ru-RU"/>
               </w:rPr>
               <w:t xml:space="preserve">(наименование </w:t>
@@ -544,12 +522,16 @@
             <w:r>
               <w:rPr>
                 <w:rFonts w:ascii="Times New Roman" w:hAnsi="Times New Roman"/>
+                <w:sz w:val="20"/>
+                <w:szCs w:val="20"/>
               </w:rPr>
               <w:t>юридического лица, фамилия, собственное имя, отчество (если таковое имеется) индивидуального предпринимателя</w:t>
             </w:r>
             <w:r>
               <w:rPr>
                 <w:rFonts w:ascii="Times New Roman" w:eastAsia="Times New Roman" w:hAnsi="Times New Roman"/>
+                <w:sz w:val="20"/>
+                <w:szCs w:val="20"/>
                 <w:lang w:eastAsia="ru-RU"/>
               </w:rPr>
               <w:t>)</w:t>
@@ -1601,8 +1583,8 @@
             <w:r>
               <w:rPr>
                 <w:rFonts w:ascii="Times New Roman" w:hAnsi="Times New Roman"/>
-                <w:sz w:val="16"/>
-                <w:szCs w:val="16"/>
+                <w:sz w:val="20"/>
+                <w:szCs w:val="20"/>
               </w:rPr>
               <w:t>код</w:t>
             </w:r>
@@ -1650,8 +1632,8 @@
             <w:r>
               <w:rPr>
                 <w:rFonts w:ascii="Times New Roman" w:hAnsi="Times New Roman"/>
-                <w:sz w:val="16"/>
-                <w:szCs w:val="16"/>
+                <w:sz w:val="20"/>
+                <w:szCs w:val="20"/>
               </w:rPr>
               <w:t>отход</w:t>
             </w:r>
@@ -1699,8 +1681,8 @@
             <w:r>
               <w:rPr>
                 <w:rFonts w:ascii="Times New Roman" w:hAnsi="Times New Roman"/>
-                <w:sz w:val="16"/>
-                <w:szCs w:val="16"/>
+                <w:sz w:val="20"/>
+                <w:szCs w:val="20"/>
               </w:rPr>
               <w:t>норматив</w:t>
             </w:r>
@@ -1748,8 +1730,8 @@
             <w:r>
               <w:rPr>
                 <w:rFonts w:ascii="Times New Roman" w:hAnsi="Times New Roman"/>
-                <w:sz w:val="16"/>
-                <w:szCs w:val="16"/>
+                <w:sz w:val="20"/>
+                <w:szCs w:val="20"/>
               </w:rPr>
               <w:t>количество</w:t>
             </w:r>
@@ -1798,8 +1780,8 @@
             <w:r>
               <w:rPr>
                 <w:rFonts w:ascii="Times New Roman" w:hAnsi="Times New Roman"/>
-                <w:sz w:val="16"/>
-                <w:szCs w:val="16"/>
+                <w:sz w:val="20"/>
+                <w:szCs w:val="20"/>
               </w:rPr>
               <w:t>кол_заготовка</w:t>
             </w:r>
@@ -1850,8 +1832,8 @@
             <w:r>
               <w:rPr>
                 <w:rFonts w:ascii="Times New Roman" w:hAnsi="Times New Roman"/>
-                <w:sz w:val="16"/>
-                <w:szCs w:val="16"/>
+                <w:sz w:val="20"/>
+                <w:szCs w:val="20"/>
               </w:rPr>
               <w:t>кол_сортировка</w:t>
             </w:r>
@@ -1901,8 +1883,8 @@
             <w:r>
               <w:rPr>
                 <w:rFonts w:ascii="Times New Roman" w:hAnsi="Times New Roman"/>
-                <w:sz w:val="16"/>
-                <w:szCs w:val="16"/>
+                <w:sz w:val="20"/>
+                <w:szCs w:val="20"/>
               </w:rPr>
               <w:t>кол_использование</w:t>
             </w:r>
@@ -1952,8 +1934,8 @@
             <w:r>
               <w:rPr>
                 <w:rFonts w:ascii="Times New Roman" w:hAnsi="Times New Roman"/>
-                <w:sz w:val="16"/>
-                <w:szCs w:val="16"/>
+                <w:sz w:val="20"/>
+                <w:szCs w:val="20"/>
               </w:rPr>
               <w:t>кол_обезвреживание</w:t>
             </w:r>
@@ -2003,8 +1985,8 @@
             <w:r>
               <w:rPr>
                 <w:rFonts w:ascii="Times New Roman" w:hAnsi="Times New Roman"/>
-                <w:sz w:val="16"/>
-                <w:szCs w:val="16"/>
+                <w:sz w:val="20"/>
+                <w:szCs w:val="20"/>
               </w:rPr>
               <w:t>кол_хранение</w:t>
             </w:r>
@@ -2053,8 +2035,8 @@
             <w:r>
               <w:rPr>
                 <w:rFonts w:ascii="Times New Roman" w:hAnsi="Times New Roman"/>
-                <w:sz w:val="16"/>
-                <w:szCs w:val="16"/>
+                <w:sz w:val="20"/>
+                <w:szCs w:val="20"/>
               </w:rPr>
               <w:t>кол_захоронение</w:t>
             </w:r>
@@ -2192,47 +2174,31 @@
                 <w:sz w:val="20"/>
                 <w:szCs w:val="20"/>
               </w:rPr>
-              <w:t>[</w:t>
-            </w:r>
-            <w:r>
-              <w:rPr>
-                <w:rFonts w:ascii="Times New Roman" w:hAnsi="Times New Roman"/>
-                <w:sz w:val="16"/>
-                <w:szCs w:val="16"/>
-              </w:rPr>
-              <w:t>сумма</w:t>
-            </w:r>
-            <w:r>
-              <w:rPr>
-                <w:rFonts w:ascii="Times New Roman" w:hAnsi="Times New Roman"/>
-                <w:sz w:val="16"/>
-                <w:szCs w:val="16"/>
+              <w:t>[сумма</w:t>
+            </w:r>
+            <w:r>
+              <w:rPr>
+                <w:rFonts w:ascii="Times New Roman" w:hAnsi="Times New Roman"/>
+                <w:sz w:val="20"/>
+                <w:szCs w:val="20"/>
               </w:rPr>
               <w:t>_</w:t>
             </w:r>
             <w:r>
               <w:rPr>
                 <w:rFonts w:ascii="Times New Roman" w:hAnsi="Times New Roman"/>
-                <w:sz w:val="16"/>
-                <w:szCs w:val="16"/>
+                <w:sz w:val="20"/>
+                <w:szCs w:val="20"/>
               </w:rPr>
               <w:t>кол</w:t>
             </w:r>
             <w:r>
               <w:rPr>
                 <w:rFonts w:ascii="Times New Roman" w:hAnsi="Times New Roman"/>
-                <w:sz w:val="16"/>
-                <w:szCs w:val="16"/>
-              </w:rPr>
-              <w:t>4</w:t>
-            </w:r>
-            <w:r>
-              <w:rPr>
-                <w:rFonts w:ascii="Times New Roman" w:hAnsi="Times New Roman"/>
-                <w:sz w:val="20"/>
-                <w:szCs w:val="20"/>
-              </w:rPr>
-              <w:t>]</w:t>
+                <w:sz w:val="20"/>
+                <w:szCs w:val="20"/>
+              </w:rPr>
+              <w:t>4]</w:t>
             </w:r>
           </w:p>
         </w:tc>
@@ -2266,31 +2232,7 @@
                 <w:sz w:val="20"/>
                 <w:szCs w:val="20"/>
               </w:rPr>
-              <w:t>[</w:t>
-            </w:r>
-            <w:r>
-              <w:rPr>
-                <w:rFonts w:ascii="Times New Roman" w:hAnsi="Times New Roman"/>
-                <w:sz w:val="16"/>
-                <w:szCs w:val="16"/>
-              </w:rPr>
-              <w:t>сумма_кол</w:t>
-            </w:r>
-            <w:r>
-              <w:rPr>
-                <w:rFonts w:ascii="Times New Roman" w:hAnsi="Times New Roman"/>
-                <w:sz w:val="16"/>
-                <w:szCs w:val="16"/>
-              </w:rPr>
-              <w:t>5</w:t>
-            </w:r>
-            <w:r>
-              <w:rPr>
-                <w:rFonts w:ascii="Times New Roman" w:hAnsi="Times New Roman"/>
-                <w:sz w:val="20"/>
-                <w:szCs w:val="20"/>
-              </w:rPr>
-              <w:t>]</w:t>
+              <w:t>[сумма_кол5]</w:t>
             </w:r>
           </w:p>
         </w:tc>
@@ -2325,31 +2267,7 @@
                 <w:sz w:val="20"/>
                 <w:szCs w:val="20"/>
               </w:rPr>
-              <w:t>[</w:t>
-            </w:r>
-            <w:r>
-              <w:rPr>
-                <w:rFonts w:ascii="Times New Roman" w:hAnsi="Times New Roman"/>
-                <w:sz w:val="16"/>
-                <w:szCs w:val="16"/>
-              </w:rPr>
-              <w:t>сумма_кол</w:t>
-            </w:r>
-            <w:r>
-              <w:rPr>
-                <w:rFonts w:ascii="Times New Roman" w:hAnsi="Times New Roman"/>
-                <w:sz w:val="16"/>
-                <w:szCs w:val="16"/>
-              </w:rPr>
-              <w:t>6</w:t>
-            </w:r>
-            <w:r>
-              <w:rPr>
-                <w:rFonts w:ascii="Times New Roman" w:hAnsi="Times New Roman"/>
-                <w:sz w:val="20"/>
-                <w:szCs w:val="20"/>
-              </w:rPr>
-              <w:t>]</w:t>
+              <w:t>[сумма_кол6]</w:t>
             </w:r>
           </w:p>
         </w:tc>
@@ -2383,31 +2301,7 @@
                 <w:sz w:val="20"/>
                 <w:szCs w:val="20"/>
               </w:rPr>
-              <w:t>[</w:t>
-            </w:r>
-            <w:r>
-              <w:rPr>
-                <w:rFonts w:ascii="Times New Roman" w:hAnsi="Times New Roman"/>
-                <w:sz w:val="16"/>
-                <w:szCs w:val="16"/>
-              </w:rPr>
-              <w:t>сумма_кол</w:t>
-            </w:r>
-            <w:r>
-              <w:rPr>
-                <w:rFonts w:ascii="Times New Roman" w:hAnsi="Times New Roman"/>
-                <w:sz w:val="16"/>
-                <w:szCs w:val="16"/>
-              </w:rPr>
-              <w:t>7</w:t>
-            </w:r>
-            <w:r>
-              <w:rPr>
-                <w:rFonts w:ascii="Times New Roman" w:hAnsi="Times New Roman"/>
-                <w:sz w:val="20"/>
-                <w:szCs w:val="20"/>
-              </w:rPr>
-              <w:t>]</w:t>
+              <w:t>[сумма_кол7]</w:t>
             </w:r>
           </w:p>
         </w:tc>
@@ -2440,31 +2334,7 @@
                 <w:sz w:val="20"/>
                 <w:szCs w:val="20"/>
               </w:rPr>
-              <w:t>[</w:t>
-            </w:r>
-            <w:r>
-              <w:rPr>
-                <w:rFonts w:ascii="Times New Roman" w:hAnsi="Times New Roman"/>
-                <w:sz w:val="16"/>
-                <w:szCs w:val="16"/>
-              </w:rPr>
-              <w:t>сумма_кол</w:t>
-            </w:r>
-            <w:r>
-              <w:rPr>
-                <w:rFonts w:ascii="Times New Roman" w:hAnsi="Times New Roman"/>
-                <w:sz w:val="16"/>
-                <w:szCs w:val="16"/>
-              </w:rPr>
-              <w:t>8</w:t>
-            </w:r>
-            <w:r>
-              <w:rPr>
-                <w:rFonts w:ascii="Times New Roman" w:hAnsi="Times New Roman"/>
-                <w:sz w:val="20"/>
-                <w:szCs w:val="20"/>
-              </w:rPr>
-              <w:t>]</w:t>
+              <w:t>[сумма_кол8]</w:t>
             </w:r>
           </w:p>
         </w:tc>
@@ -2498,31 +2368,7 @@
                 <w:sz w:val="20"/>
                 <w:szCs w:val="20"/>
               </w:rPr>
-              <w:t>[</w:t>
-            </w:r>
-            <w:r>
-              <w:rPr>
-                <w:rFonts w:ascii="Times New Roman" w:hAnsi="Times New Roman"/>
-                <w:sz w:val="16"/>
-                <w:szCs w:val="16"/>
-              </w:rPr>
-              <w:t>сумма_кол</w:t>
-            </w:r>
-            <w:r>
-              <w:rPr>
-                <w:rFonts w:ascii="Times New Roman" w:hAnsi="Times New Roman"/>
-                <w:sz w:val="16"/>
-                <w:szCs w:val="16"/>
-              </w:rPr>
-              <w:t>9</w:t>
-            </w:r>
-            <w:r>
-              <w:rPr>
-                <w:rFonts w:ascii="Times New Roman" w:hAnsi="Times New Roman"/>
-                <w:sz w:val="20"/>
-                <w:szCs w:val="20"/>
-              </w:rPr>
-              <w:t>]</w:t>
+              <w:t>[сумма_кол9]</w:t>
             </w:r>
           </w:p>
         </w:tc>
@@ -2555,31 +2401,7 @@
                 <w:sz w:val="20"/>
                 <w:szCs w:val="20"/>
               </w:rPr>
-              <w:t>[</w:t>
-            </w:r>
-            <w:r>
-              <w:rPr>
-                <w:rFonts w:ascii="Times New Roman" w:hAnsi="Times New Roman"/>
-                <w:sz w:val="16"/>
-                <w:szCs w:val="16"/>
-              </w:rPr>
-              <w:t>сумма_кол</w:t>
-            </w:r>
-            <w:r>
-              <w:rPr>
-                <w:rFonts w:ascii="Times New Roman" w:hAnsi="Times New Roman"/>
-                <w:sz w:val="16"/>
-                <w:szCs w:val="16"/>
-              </w:rPr>
-              <w:t>10</w:t>
-            </w:r>
-            <w:r>
-              <w:rPr>
-                <w:rFonts w:ascii="Times New Roman" w:hAnsi="Times New Roman"/>
-                <w:sz w:val="20"/>
-                <w:szCs w:val="20"/>
-              </w:rPr>
-              <w:t>]</w:t>
+              <w:t>[сумма_кол10]</w:t>
             </w:r>
           </w:p>
         </w:tc>
@@ -2928,8 +2750,8 @@
             <w:r>
               <w:rPr>
                 <w:rFonts w:ascii="Times New Roman" w:hAnsi="Times New Roman"/>
-                <w:sz w:val="16"/>
-                <w:szCs w:val="16"/>
+                <w:sz w:val="20"/>
+                <w:szCs w:val="20"/>
               </w:rPr>
               <w:t>код</w:t>
             </w:r>
@@ -2983,8 +2805,8 @@
             <w:r>
               <w:rPr>
                 <w:rFonts w:ascii="Times New Roman" w:hAnsi="Times New Roman"/>
-                <w:sz w:val="16"/>
-                <w:szCs w:val="16"/>
+                <w:sz w:val="20"/>
+                <w:szCs w:val="20"/>
               </w:rPr>
               <w:t>отход</w:t>
             </w:r>
@@ -3027,10 +2849,6 @@
               <w:t>[</w:t>
             </w:r>
             <w:r>
-              <w:rPr>
-                <w:sz w:val="16"/>
-                <w:szCs w:val="16"/>
-              </w:rPr>
               <w:t>норматив</w:t>
             </w:r>
             <w:r>
@@ -3074,8 +2892,8 @@
             <w:r>
               <w:rPr>
                 <w:rFonts w:ascii="Times New Roman" w:hAnsi="Times New Roman"/>
-                <w:sz w:val="16"/>
-                <w:szCs w:val="16"/>
+                <w:sz w:val="20"/>
+                <w:szCs w:val="20"/>
               </w:rPr>
               <w:t>количество</w:t>
             </w:r>
@@ -3127,8 +2945,8 @@
             <w:r>
               <w:rPr>
                 <w:rFonts w:ascii="Times New Roman" w:hAnsi="Times New Roman"/>
-                <w:sz w:val="16"/>
-                <w:szCs w:val="16"/>
+                <w:sz w:val="20"/>
+                <w:szCs w:val="20"/>
               </w:rPr>
               <w:t>кол_заготовка</w:t>
             </w:r>
@@ -3182,8 +3000,8 @@
             <w:r>
               <w:rPr>
                 <w:rFonts w:ascii="Times New Roman" w:hAnsi="Times New Roman"/>
-                <w:sz w:val="16"/>
-                <w:szCs w:val="16"/>
+                <w:sz w:val="20"/>
+                <w:szCs w:val="20"/>
               </w:rPr>
               <w:t>кол_сортировка</w:t>
             </w:r>
@@ -3233,8 +3051,8 @@
             <w:r>
               <w:rPr>
                 <w:rFonts w:ascii="Times New Roman" w:hAnsi="Times New Roman"/>
-                <w:sz w:val="16"/>
-                <w:szCs w:val="16"/>
+                <w:sz w:val="20"/>
+                <w:szCs w:val="20"/>
               </w:rPr>
               <w:t>кол_использование</w:t>
             </w:r>
@@ -3287,8 +3105,8 @@
             <w:r>
               <w:rPr>
                 <w:rFonts w:ascii="Times New Roman" w:hAnsi="Times New Roman"/>
-                <w:sz w:val="16"/>
-                <w:szCs w:val="16"/>
+                <w:sz w:val="20"/>
+                <w:szCs w:val="20"/>
               </w:rPr>
               <w:t>кол_обезвреживание</w:t>
             </w:r>
@@ -3341,8 +3159,8 @@
             <w:r>
               <w:rPr>
                 <w:rFonts w:ascii="Times New Roman" w:hAnsi="Times New Roman"/>
-                <w:sz w:val="16"/>
-                <w:szCs w:val="16"/>
+                <w:sz w:val="20"/>
+                <w:szCs w:val="20"/>
               </w:rPr>
               <w:t>кол_хранение</w:t>
             </w:r>
@@ -3391,8 +3209,8 @@
             <w:r>
               <w:rPr>
                 <w:rFonts w:ascii="Times New Roman" w:hAnsi="Times New Roman"/>
-                <w:sz w:val="16"/>
-                <w:szCs w:val="16"/>
+                <w:sz w:val="20"/>
+                <w:szCs w:val="20"/>
               </w:rPr>
               <w:t>кол_захоронение</w:t>
             </w:r>
@@ -3895,8 +3713,8 @@
             <w:r>
               <w:rPr>
                 <w:rFonts w:ascii="Times New Roman" w:hAnsi="Times New Roman"/>
-                <w:sz w:val="16"/>
-                <w:szCs w:val="16"/>
+                <w:sz w:val="20"/>
+                <w:szCs w:val="20"/>
               </w:rPr>
               <w:t>код</w:t>
             </w:r>
@@ -3944,8 +3762,8 @@
             <w:r>
               <w:rPr>
                 <w:rFonts w:ascii="Times New Roman" w:hAnsi="Times New Roman"/>
-                <w:sz w:val="16"/>
-                <w:szCs w:val="16"/>
+                <w:sz w:val="20"/>
+                <w:szCs w:val="20"/>
               </w:rPr>
               <w:t>отход</w:t>
             </w:r>
@@ -3993,8 +3811,8 @@
             <w:r>
               <w:rPr>
                 <w:rFonts w:ascii="Times New Roman" w:hAnsi="Times New Roman"/>
-                <w:sz w:val="16"/>
-                <w:szCs w:val="16"/>
+                <w:sz w:val="20"/>
+                <w:szCs w:val="20"/>
               </w:rPr>
               <w:t>норматив</w:t>
             </w:r>
@@ -4042,8 +3860,8 @@
             <w:r>
               <w:rPr>
                 <w:rFonts w:ascii="Times New Roman" w:hAnsi="Times New Roman"/>
-                <w:sz w:val="16"/>
-                <w:szCs w:val="16"/>
+                <w:sz w:val="20"/>
+                <w:szCs w:val="20"/>
               </w:rPr>
               <w:t>количество</w:t>
             </w:r>
@@ -4092,8 +3910,8 @@
             <w:r>
               <w:rPr>
                 <w:rFonts w:ascii="Times New Roman" w:hAnsi="Times New Roman"/>
-                <w:sz w:val="16"/>
-                <w:szCs w:val="16"/>
+                <w:sz w:val="20"/>
+                <w:szCs w:val="20"/>
               </w:rPr>
               <w:t>кол_заготовка</w:t>
             </w:r>
@@ -4144,8 +3962,8 @@
             <w:r>
               <w:rPr>
                 <w:rFonts w:ascii="Times New Roman" w:hAnsi="Times New Roman"/>
-                <w:sz w:val="16"/>
-                <w:szCs w:val="16"/>
+                <w:sz w:val="20"/>
+                <w:szCs w:val="20"/>
               </w:rPr>
               <w:t>кол_сортировка</w:t>
             </w:r>
@@ -4195,8 +4013,8 @@
             <w:r>
               <w:rPr>
                 <w:rFonts w:ascii="Times New Roman" w:hAnsi="Times New Roman"/>
-                <w:sz w:val="16"/>
-                <w:szCs w:val="16"/>
+                <w:sz w:val="20"/>
+                <w:szCs w:val="20"/>
               </w:rPr>
               <w:t>кол_использование</w:t>
             </w:r>
@@ -4246,8 +4064,8 @@
             <w:r>
               <w:rPr>
                 <w:rFonts w:ascii="Times New Roman" w:hAnsi="Times New Roman"/>
-                <w:sz w:val="16"/>
-                <w:szCs w:val="16"/>
+                <w:sz w:val="20"/>
+                <w:szCs w:val="20"/>
               </w:rPr>
               <w:t>кол_обезвреживание</w:t>
             </w:r>
@@ -4297,8 +4115,8 @@
             <w:r>
               <w:rPr>
                 <w:rFonts w:ascii="Times New Roman" w:hAnsi="Times New Roman"/>
-                <w:sz w:val="16"/>
-                <w:szCs w:val="16"/>
+                <w:sz w:val="20"/>
+                <w:szCs w:val="20"/>
               </w:rPr>
               <w:t>кол_хранение</w:t>
             </w:r>
@@ -4347,8 +4165,8 @@
             <w:r>
               <w:rPr>
                 <w:rFonts w:ascii="Times New Roman" w:hAnsi="Times New Roman"/>
-                <w:sz w:val="16"/>
-                <w:szCs w:val="16"/>
+                <w:sz w:val="20"/>
+                <w:szCs w:val="20"/>
               </w:rPr>
               <w:t>кол_захоронение</w:t>
             </w:r>
@@ -4487,23 +4305,7 @@
                 <w:sz w:val="20"/>
                 <w:szCs w:val="20"/>
               </w:rPr>
-              <w:t>[</w:t>
-            </w:r>
-            <w:r>
-              <w:rPr>
-                <w:rFonts w:ascii="Times New Roman" w:hAnsi="Times New Roman"/>
-                <w:sz w:val="16"/>
-                <w:szCs w:val="16"/>
-              </w:rPr>
-              <w:t>сумма_кол4</w:t>
-            </w:r>
-            <w:r>
-              <w:rPr>
-                <w:rFonts w:ascii="Times New Roman" w:hAnsi="Times New Roman"/>
-                <w:sz w:val="20"/>
-                <w:szCs w:val="20"/>
-              </w:rPr>
-              <w:t>]</w:t>
+              <w:t>[сумма_кол4]</w:t>
             </w:r>
           </w:p>
         </w:tc>
@@ -4537,23 +4339,7 @@
                 <w:sz w:val="20"/>
                 <w:szCs w:val="20"/>
               </w:rPr>
-              <w:t>[</w:t>
-            </w:r>
-            <w:r>
-              <w:rPr>
-                <w:rFonts w:ascii="Times New Roman" w:hAnsi="Times New Roman"/>
-                <w:sz w:val="16"/>
-                <w:szCs w:val="16"/>
-              </w:rPr>
-              <w:t>сумма_кол5</w:t>
-            </w:r>
-            <w:r>
-              <w:rPr>
-                <w:rFonts w:ascii="Times New Roman" w:hAnsi="Times New Roman"/>
-                <w:sz w:val="20"/>
-                <w:szCs w:val="20"/>
-              </w:rPr>
-              <w:t>]</w:t>
+              <w:t>[сумма_кол5]</w:t>
             </w:r>
           </w:p>
         </w:tc>
@@ -4588,23 +4374,7 @@
                 <w:sz w:val="20"/>
                 <w:szCs w:val="20"/>
               </w:rPr>
-              <w:t>[</w:t>
-            </w:r>
-            <w:r>
-              <w:rPr>
-                <w:rFonts w:ascii="Times New Roman" w:hAnsi="Times New Roman"/>
-                <w:sz w:val="16"/>
-                <w:szCs w:val="16"/>
-              </w:rPr>
-              <w:t>сумма_кол6</w:t>
-            </w:r>
-            <w:r>
-              <w:rPr>
-                <w:rFonts w:ascii="Times New Roman" w:hAnsi="Times New Roman"/>
-                <w:sz w:val="20"/>
-                <w:szCs w:val="20"/>
-              </w:rPr>
-              <w:t>]</w:t>
+              <w:t>[сумма_кол6]</w:t>
             </w:r>
           </w:p>
         </w:tc>
@@ -4637,23 +4407,7 @@
                 <w:sz w:val="20"/>
                 <w:szCs w:val="20"/>
               </w:rPr>
-              <w:t>[</w:t>
-            </w:r>
-            <w:r>
-              <w:rPr>
-                <w:rFonts w:ascii="Times New Roman" w:hAnsi="Times New Roman"/>
-                <w:sz w:val="16"/>
-                <w:szCs w:val="16"/>
-              </w:rPr>
-              <w:t>сумма_кол7</w:t>
-            </w:r>
-            <w:r>
-              <w:rPr>
-                <w:rFonts w:ascii="Times New Roman" w:hAnsi="Times New Roman"/>
-                <w:sz w:val="20"/>
-                <w:szCs w:val="20"/>
-              </w:rPr>
-              <w:t>]</w:t>
+              <w:t>[сумма_кол7]</w:t>
             </w:r>
           </w:p>
         </w:tc>
@@ -4684,23 +4438,7 @@
                 <w:sz w:val="20"/>
                 <w:szCs w:val="20"/>
               </w:rPr>
-              <w:t>[</w:t>
-            </w:r>
-            <w:r>
-              <w:rPr>
-                <w:rFonts w:ascii="Times New Roman" w:hAnsi="Times New Roman"/>
-                <w:sz w:val="16"/>
-                <w:szCs w:val="16"/>
-              </w:rPr>
-              <w:t>сумма_кол8</w:t>
-            </w:r>
-            <w:r>
-              <w:rPr>
-                <w:rFonts w:ascii="Times New Roman" w:hAnsi="Times New Roman"/>
-                <w:sz w:val="20"/>
-                <w:szCs w:val="20"/>
-              </w:rPr>
-              <w:t>]</w:t>
+              <w:t>[сумма_кол8]</w:t>
             </w:r>
           </w:p>
         </w:tc>
@@ -4732,23 +4470,7 @@
                 <w:sz w:val="20"/>
                 <w:szCs w:val="20"/>
               </w:rPr>
-              <w:t>[</w:t>
-            </w:r>
-            <w:r>
-              <w:rPr>
-                <w:rFonts w:ascii="Times New Roman" w:hAnsi="Times New Roman"/>
-                <w:sz w:val="16"/>
-                <w:szCs w:val="16"/>
-              </w:rPr>
-              <w:t>сумма_кол9</w:t>
-            </w:r>
-            <w:r>
-              <w:rPr>
-                <w:rFonts w:ascii="Times New Roman" w:hAnsi="Times New Roman"/>
-                <w:sz w:val="20"/>
-                <w:szCs w:val="20"/>
-              </w:rPr>
-              <w:t>]</w:t>
+              <w:t>[сумма_кол9]</w:t>
             </w:r>
           </w:p>
         </w:tc>
@@ -4780,23 +4502,7 @@
                 <w:sz w:val="20"/>
                 <w:szCs w:val="20"/>
               </w:rPr>
-              <w:t>[</w:t>
-            </w:r>
-            <w:r>
-              <w:rPr>
-                <w:rFonts w:ascii="Times New Roman" w:hAnsi="Times New Roman"/>
-                <w:sz w:val="16"/>
-                <w:szCs w:val="16"/>
-              </w:rPr>
-              <w:t>сумма_кол10</w:t>
-            </w:r>
-            <w:r>
-              <w:rPr>
-                <w:rFonts w:ascii="Times New Roman" w:hAnsi="Times New Roman"/>
-                <w:sz w:val="20"/>
-                <w:szCs w:val="20"/>
-              </w:rPr>
-              <w:t>]</w:t>
+              <w:t>[сумма_кол10]</w:t>
             </w:r>
           </w:p>
         </w:tc>
@@ -4865,8 +4571,8 @@
             <w:r>
               <w:rPr>
                 <w:rFonts w:ascii="Times New Roman" w:hAnsi="Times New Roman"/>
-                <w:sz w:val="16"/>
-                <w:szCs w:val="16"/>
+                <w:sz w:val="20"/>
+                <w:szCs w:val="20"/>
               </w:rPr>
               <w:t>код</w:t>
             </w:r>
@@ -4917,8 +4623,8 @@
             <w:r>
               <w:rPr>
                 <w:rFonts w:ascii="Times New Roman" w:hAnsi="Times New Roman"/>
-                <w:sz w:val="16"/>
-                <w:szCs w:val="16"/>
+                <w:sz w:val="20"/>
+                <w:szCs w:val="20"/>
               </w:rPr>
               <w:t>отход</w:t>
             </w:r>
@@ -4966,8 +4672,8 @@
             <w:r>
               <w:rPr>
                 <w:rFonts w:ascii="Times New Roman" w:hAnsi="Times New Roman"/>
-                <w:sz w:val="16"/>
-                <w:szCs w:val="16"/>
+                <w:sz w:val="20"/>
+                <w:szCs w:val="20"/>
               </w:rPr>
               <w:t>норматив</w:t>
             </w:r>
@@ -5015,8 +4721,8 @@
             <w:r>
               <w:rPr>
                 <w:rFonts w:ascii="Times New Roman" w:hAnsi="Times New Roman"/>
-                <w:sz w:val="16"/>
-                <w:szCs w:val="16"/>
+                <w:sz w:val="20"/>
+                <w:szCs w:val="20"/>
               </w:rPr>
               <w:t>количество</w:t>
             </w:r>
@@ -5065,8 +4771,8 @@
             <w:r>
               <w:rPr>
                 <w:rFonts w:ascii="Times New Roman" w:hAnsi="Times New Roman"/>
-                <w:sz w:val="16"/>
-                <w:szCs w:val="16"/>
+                <w:sz w:val="20"/>
+                <w:szCs w:val="20"/>
               </w:rPr>
               <w:t>кол_заготовка</w:t>
             </w:r>
@@ -5117,8 +4823,8 @@
             <w:r>
               <w:rPr>
                 <w:rFonts w:ascii="Times New Roman" w:hAnsi="Times New Roman"/>
-                <w:sz w:val="16"/>
-                <w:szCs w:val="16"/>
+                <w:sz w:val="20"/>
+                <w:szCs w:val="20"/>
               </w:rPr>
               <w:t>кол_сортировка</w:t>
             </w:r>
@@ -5168,8 +4874,8 @@
             <w:r>
               <w:rPr>
                 <w:rFonts w:ascii="Times New Roman" w:hAnsi="Times New Roman"/>
-                <w:sz w:val="16"/>
-                <w:szCs w:val="16"/>
+                <w:sz w:val="20"/>
+                <w:szCs w:val="20"/>
               </w:rPr>
               <w:t>кол_использование</w:t>
             </w:r>
@@ -5219,8 +4925,8 @@
             <w:r>
               <w:rPr>
                 <w:rFonts w:ascii="Times New Roman" w:hAnsi="Times New Roman"/>
-                <w:sz w:val="16"/>
-                <w:szCs w:val="16"/>
+                <w:sz w:val="20"/>
+                <w:szCs w:val="20"/>
               </w:rPr>
               <w:t>кол_обезвреживание</w:t>
             </w:r>
@@ -5270,8 +4976,8 @@
             <w:r>
               <w:rPr>
                 <w:rFonts w:ascii="Times New Roman" w:hAnsi="Times New Roman"/>
-                <w:sz w:val="16"/>
-                <w:szCs w:val="16"/>
+                <w:sz w:val="20"/>
+                <w:szCs w:val="20"/>
               </w:rPr>
               <w:t>кол_хранение</w:t>
             </w:r>
@@ -5320,8 +5026,8 @@
             <w:r>
               <w:rPr>
                 <w:rFonts w:ascii="Times New Roman" w:hAnsi="Times New Roman"/>
-                <w:sz w:val="16"/>
-                <w:szCs w:val="16"/>
+                <w:sz w:val="20"/>
+                <w:szCs w:val="20"/>
               </w:rPr>
               <w:t>кол_захоронение</w:t>
             </w:r>
@@ -5401,6 +5107,7 @@
                 <w:szCs w:val="20"/>
                 <w:lang w:eastAsia="ru-RU"/>
               </w:rPr>
+              <w:lastRenderedPageBreak/>
               <w:t>Итого отходов 4 класса опасности</w:t>
             </w:r>
           </w:p>
@@ -5463,23 +5170,7 @@
                 <w:sz w:val="20"/>
                 <w:szCs w:val="20"/>
               </w:rPr>
-              <w:t>[</w:t>
-            </w:r>
-            <w:r>
-              <w:rPr>
-                <w:rFonts w:ascii="Times New Roman" w:hAnsi="Times New Roman"/>
-                <w:sz w:val="16"/>
-                <w:szCs w:val="16"/>
-              </w:rPr>
-              <w:t>сумма_кол4</w:t>
-            </w:r>
-            <w:r>
-              <w:rPr>
-                <w:rFonts w:ascii="Times New Roman" w:hAnsi="Times New Roman"/>
-                <w:sz w:val="20"/>
-                <w:szCs w:val="20"/>
-              </w:rPr>
-              <w:t>]</w:t>
+              <w:t>[сумма_кол4]</w:t>
             </w:r>
           </w:p>
         </w:tc>
@@ -5513,23 +5204,7 @@
                 <w:sz w:val="20"/>
                 <w:szCs w:val="20"/>
               </w:rPr>
-              <w:t>[</w:t>
-            </w:r>
-            <w:r>
-              <w:rPr>
-                <w:rFonts w:ascii="Times New Roman" w:hAnsi="Times New Roman"/>
-                <w:sz w:val="16"/>
-                <w:szCs w:val="16"/>
-              </w:rPr>
-              <w:t>сумма_кол5</w:t>
-            </w:r>
-            <w:r>
-              <w:rPr>
-                <w:rFonts w:ascii="Times New Roman" w:hAnsi="Times New Roman"/>
-                <w:sz w:val="20"/>
-                <w:szCs w:val="20"/>
-              </w:rPr>
-              <w:t>]</w:t>
+              <w:t>[сумма_кол5]</w:t>
             </w:r>
           </w:p>
         </w:tc>
@@ -5564,23 +5239,7 @@
                 <w:sz w:val="20"/>
                 <w:szCs w:val="20"/>
               </w:rPr>
-              <w:t>[</w:t>
-            </w:r>
-            <w:r>
-              <w:rPr>
-                <w:rFonts w:ascii="Times New Roman" w:hAnsi="Times New Roman"/>
-                <w:sz w:val="16"/>
-                <w:szCs w:val="16"/>
-              </w:rPr>
-              <w:t>сумма_кол6</w:t>
-            </w:r>
-            <w:r>
-              <w:rPr>
-                <w:rFonts w:ascii="Times New Roman" w:hAnsi="Times New Roman"/>
-                <w:sz w:val="20"/>
-                <w:szCs w:val="20"/>
-              </w:rPr>
-              <w:t>]</w:t>
+              <w:t>[сумма_кол6]</w:t>
             </w:r>
           </w:p>
         </w:tc>
@@ -5614,23 +5273,7 @@
                 <w:sz w:val="20"/>
                 <w:szCs w:val="20"/>
               </w:rPr>
-              <w:t>[</w:t>
-            </w:r>
-            <w:r>
-              <w:rPr>
-                <w:rFonts w:ascii="Times New Roman" w:hAnsi="Times New Roman"/>
-                <w:sz w:val="16"/>
-                <w:szCs w:val="16"/>
-              </w:rPr>
-              <w:t>сумма_кол7</w:t>
-            </w:r>
-            <w:r>
-              <w:rPr>
-                <w:rFonts w:ascii="Times New Roman" w:hAnsi="Times New Roman"/>
-                <w:sz w:val="20"/>
-                <w:szCs w:val="20"/>
-              </w:rPr>
-              <w:t>]</w:t>
+              <w:t>[сумма_кол7]</w:t>
             </w:r>
           </w:p>
         </w:tc>
@@ -5661,23 +5304,7 @@
                 <w:sz w:val="20"/>
                 <w:szCs w:val="20"/>
               </w:rPr>
-              <w:t>[</w:t>
-            </w:r>
-            <w:r>
-              <w:rPr>
-                <w:rFonts w:ascii="Times New Roman" w:hAnsi="Times New Roman"/>
-                <w:sz w:val="16"/>
-                <w:szCs w:val="16"/>
-              </w:rPr>
-              <w:t>сумма_кол8</w:t>
-            </w:r>
-            <w:r>
-              <w:rPr>
-                <w:rFonts w:ascii="Times New Roman" w:hAnsi="Times New Roman"/>
-                <w:sz w:val="20"/>
-                <w:szCs w:val="20"/>
-              </w:rPr>
-              <w:t>]</w:t>
+              <w:t>[сумма_кол8]</w:t>
             </w:r>
           </w:p>
         </w:tc>
@@ -5711,23 +5338,7 @@
                 <w:sz w:val="20"/>
                 <w:szCs w:val="20"/>
               </w:rPr>
-              <w:t>[</w:t>
-            </w:r>
-            <w:r>
-              <w:rPr>
-                <w:rFonts w:ascii="Times New Roman" w:hAnsi="Times New Roman"/>
-                <w:sz w:val="16"/>
-                <w:szCs w:val="16"/>
-              </w:rPr>
-              <w:t>сумма_кол9</w:t>
-            </w:r>
-            <w:r>
-              <w:rPr>
-                <w:rFonts w:ascii="Times New Roman" w:hAnsi="Times New Roman"/>
-                <w:sz w:val="20"/>
-                <w:szCs w:val="20"/>
-              </w:rPr>
-              <w:t>]</w:t>
+              <w:t>[сумма_кол9]</w:t>
             </w:r>
           </w:p>
         </w:tc>
@@ -5759,23 +5370,7 @@
                 <w:sz w:val="20"/>
                 <w:szCs w:val="20"/>
               </w:rPr>
-              <w:t>[</w:t>
-            </w:r>
-            <w:r>
-              <w:rPr>
-                <w:rFonts w:ascii="Times New Roman" w:hAnsi="Times New Roman"/>
-                <w:sz w:val="16"/>
-                <w:szCs w:val="16"/>
-              </w:rPr>
-              <w:t>сумма_кол10</w:t>
-            </w:r>
-            <w:r>
-              <w:rPr>
-                <w:rFonts w:ascii="Times New Roman" w:hAnsi="Times New Roman"/>
-                <w:sz w:val="20"/>
-                <w:szCs w:val="20"/>
-              </w:rPr>
-              <w:t>]</w:t>
+              <w:t>[сумма_кол10]</w:t>
             </w:r>
           </w:p>
         </w:tc>
@@ -5820,8 +5415,8 @@
             <w:r>
               <w:rPr>
                 <w:rFonts w:ascii="Times New Roman" w:hAnsi="Times New Roman"/>
-                <w:sz w:val="16"/>
-                <w:szCs w:val="16"/>
+                <w:sz w:val="20"/>
+                <w:szCs w:val="20"/>
               </w:rPr>
               <w:t>код</w:t>
             </w:r>
@@ -5869,8 +5464,8 @@
             <w:r>
               <w:rPr>
                 <w:rFonts w:ascii="Times New Roman" w:hAnsi="Times New Roman"/>
-                <w:sz w:val="16"/>
-                <w:szCs w:val="16"/>
+                <w:sz w:val="20"/>
+                <w:szCs w:val="20"/>
               </w:rPr>
               <w:t>отход</w:t>
             </w:r>
@@ -5918,8 +5513,8 @@
             <w:r>
               <w:rPr>
                 <w:rFonts w:ascii="Times New Roman" w:hAnsi="Times New Roman"/>
-                <w:sz w:val="16"/>
-                <w:szCs w:val="16"/>
+                <w:sz w:val="20"/>
+                <w:szCs w:val="20"/>
               </w:rPr>
               <w:t>норматив</w:t>
             </w:r>
@@ -5967,8 +5562,8 @@
             <w:r>
               <w:rPr>
                 <w:rFonts w:ascii="Times New Roman" w:hAnsi="Times New Roman"/>
-                <w:sz w:val="16"/>
-                <w:szCs w:val="16"/>
+                <w:sz w:val="20"/>
+                <w:szCs w:val="20"/>
               </w:rPr>
               <w:t>количество</w:t>
             </w:r>
@@ -6017,19 +5612,10 @@
             <w:r>
               <w:rPr>
                 <w:rFonts w:ascii="Times New Roman" w:hAnsi="Times New Roman"/>
-                <w:sz w:val="16"/>
-                <w:szCs w:val="16"/>
-              </w:rPr>
-              <w:t>кол_заготов</w:t>
-            </w:r>
-            <w:r>
-              <w:rPr>
-                <w:rFonts w:ascii="Times New Roman" w:hAnsi="Times New Roman"/>
-                <w:sz w:val="16"/>
-                <w:szCs w:val="16"/>
-              </w:rPr>
-              <w:lastRenderedPageBreak/>
-              <w:t>ка</w:t>
+                <w:sz w:val="20"/>
+                <w:szCs w:val="20"/>
+              </w:rPr>
+              <w:t>кол_заготовка</w:t>
             </w:r>
             <w:proofErr w:type="spellEnd"/>
             <w:r>
@@ -6072,15 +5658,14 @@
                 <w:szCs w:val="20"/>
                 <w:lang w:val="en-US"/>
               </w:rPr>
-              <w:lastRenderedPageBreak/>
               <w:t>[</w:t>
             </w:r>
             <w:proofErr w:type="spellStart"/>
             <w:r>
               <w:rPr>
                 <w:rFonts w:ascii="Times New Roman" w:hAnsi="Times New Roman"/>
-                <w:sz w:val="16"/>
-                <w:szCs w:val="16"/>
+                <w:sz w:val="20"/>
+                <w:szCs w:val="20"/>
               </w:rPr>
               <w:t>кол_сортировка</w:t>
             </w:r>
@@ -6130,8 +5715,8 @@
             <w:r>
               <w:rPr>
                 <w:rFonts w:ascii="Times New Roman" w:hAnsi="Times New Roman"/>
-                <w:sz w:val="16"/>
-                <w:szCs w:val="16"/>
+                <w:sz w:val="20"/>
+                <w:szCs w:val="20"/>
               </w:rPr>
               <w:t>кол_использование</w:t>
             </w:r>
@@ -6181,19 +5766,10 @@
             <w:r>
               <w:rPr>
                 <w:rFonts w:ascii="Times New Roman" w:hAnsi="Times New Roman"/>
-                <w:sz w:val="16"/>
-                <w:szCs w:val="16"/>
-              </w:rPr>
-              <w:t>кол_обезврежи</w:t>
-            </w:r>
-            <w:r>
-              <w:rPr>
-                <w:rFonts w:ascii="Times New Roman" w:hAnsi="Times New Roman"/>
-                <w:sz w:val="16"/>
-                <w:szCs w:val="16"/>
-              </w:rPr>
-              <w:lastRenderedPageBreak/>
-              <w:t>вание</w:t>
+                <w:sz w:val="20"/>
+                <w:szCs w:val="20"/>
+              </w:rPr>
+              <w:t>кол_обезвреживание</w:t>
             </w:r>
             <w:proofErr w:type="spellEnd"/>
             <w:r>
@@ -6235,15 +5811,14 @@
                 <w:szCs w:val="20"/>
                 <w:lang w:val="en-US"/>
               </w:rPr>
-              <w:lastRenderedPageBreak/>
               <w:t>[</w:t>
             </w:r>
             <w:proofErr w:type="spellStart"/>
             <w:r>
               <w:rPr>
                 <w:rFonts w:ascii="Times New Roman" w:hAnsi="Times New Roman"/>
-                <w:sz w:val="16"/>
-                <w:szCs w:val="16"/>
+                <w:sz w:val="20"/>
+                <w:szCs w:val="20"/>
               </w:rPr>
               <w:t>кол_хранение</w:t>
             </w:r>
@@ -6293,8 +5868,8 @@
             <w:r>
               <w:rPr>
                 <w:rFonts w:ascii="Times New Roman" w:hAnsi="Times New Roman"/>
-                <w:sz w:val="16"/>
-                <w:szCs w:val="16"/>
+                <w:sz w:val="20"/>
+                <w:szCs w:val="20"/>
               </w:rPr>
               <w:t>кол_захоронение</w:t>
             </w:r>
@@ -6350,7 +5925,6 @@
                 <w:szCs w:val="20"/>
                 <w:lang w:eastAsia="ru-RU"/>
               </w:rPr>
-              <w:lastRenderedPageBreak/>
               <w:t>Итого неопасных отходов</w:t>
             </w:r>
           </w:p>
@@ -6412,23 +5986,7 @@
                 <w:sz w:val="20"/>
                 <w:szCs w:val="20"/>
               </w:rPr>
-              <w:t>[</w:t>
-            </w:r>
-            <w:r>
-              <w:rPr>
-                <w:rFonts w:ascii="Times New Roman" w:hAnsi="Times New Roman"/>
-                <w:sz w:val="16"/>
-                <w:szCs w:val="16"/>
-              </w:rPr>
-              <w:t>сумма_кол4</w:t>
-            </w:r>
-            <w:r>
-              <w:rPr>
-                <w:rFonts w:ascii="Times New Roman" w:hAnsi="Times New Roman"/>
-                <w:sz w:val="20"/>
-                <w:szCs w:val="20"/>
-              </w:rPr>
-              <w:t>]</w:t>
+              <w:t>[сумма_кол4]</w:t>
             </w:r>
           </w:p>
         </w:tc>
@@ -6461,23 +6019,7 @@
                 <w:sz w:val="20"/>
                 <w:szCs w:val="20"/>
               </w:rPr>
-              <w:t>[</w:t>
-            </w:r>
-            <w:r>
-              <w:rPr>
-                <w:rFonts w:ascii="Times New Roman" w:hAnsi="Times New Roman"/>
-                <w:sz w:val="16"/>
-                <w:szCs w:val="16"/>
-              </w:rPr>
-              <w:t>сумма_кол5</w:t>
-            </w:r>
-            <w:r>
-              <w:rPr>
-                <w:rFonts w:ascii="Times New Roman" w:hAnsi="Times New Roman"/>
-                <w:sz w:val="20"/>
-                <w:szCs w:val="20"/>
-              </w:rPr>
-              <w:t>]</w:t>
+              <w:t>[сумма_кол5]</w:t>
             </w:r>
           </w:p>
         </w:tc>
@@ -6511,23 +6053,7 @@
                 <w:sz w:val="20"/>
                 <w:szCs w:val="20"/>
               </w:rPr>
-              <w:t>[</w:t>
-            </w:r>
-            <w:r>
-              <w:rPr>
-                <w:rFonts w:ascii="Times New Roman" w:hAnsi="Times New Roman"/>
-                <w:sz w:val="16"/>
-                <w:szCs w:val="16"/>
-              </w:rPr>
-              <w:t>сумма_кол6</w:t>
-            </w:r>
-            <w:r>
-              <w:rPr>
-                <w:rFonts w:ascii="Times New Roman" w:hAnsi="Times New Roman"/>
-                <w:sz w:val="20"/>
-                <w:szCs w:val="20"/>
-              </w:rPr>
-              <w:t>]</w:t>
+              <w:t>[сумма_кол6]</w:t>
             </w:r>
           </w:p>
         </w:tc>
@@ -6558,23 +6084,7 @@
                 <w:sz w:val="20"/>
                 <w:szCs w:val="20"/>
               </w:rPr>
-              <w:t>[</w:t>
-            </w:r>
-            <w:r>
-              <w:rPr>
-                <w:rFonts w:ascii="Times New Roman" w:hAnsi="Times New Roman"/>
-                <w:sz w:val="16"/>
-                <w:szCs w:val="16"/>
-              </w:rPr>
-              <w:t>сумма_кол7</w:t>
-            </w:r>
-            <w:r>
-              <w:rPr>
-                <w:rFonts w:ascii="Times New Roman" w:hAnsi="Times New Roman"/>
-                <w:sz w:val="20"/>
-                <w:szCs w:val="20"/>
-              </w:rPr>
-              <w:t>]</w:t>
+              <w:t>[сумма_кол7]</w:t>
             </w:r>
           </w:p>
         </w:tc>
@@ -6605,23 +6115,7 @@
                 <w:sz w:val="20"/>
                 <w:szCs w:val="20"/>
               </w:rPr>
-              <w:t>[</w:t>
-            </w:r>
-            <w:r>
-              <w:rPr>
-                <w:rFonts w:ascii="Times New Roman" w:hAnsi="Times New Roman"/>
-                <w:sz w:val="16"/>
-                <w:szCs w:val="16"/>
-              </w:rPr>
-              <w:t>сумма_кол8</w:t>
-            </w:r>
-            <w:r>
-              <w:rPr>
-                <w:rFonts w:ascii="Times New Roman" w:hAnsi="Times New Roman"/>
-                <w:sz w:val="20"/>
-                <w:szCs w:val="20"/>
-              </w:rPr>
-              <w:t>]</w:t>
+              <w:t>[сумма_кол8]</w:t>
             </w:r>
           </w:p>
         </w:tc>
@@ -6652,23 +6146,7 @@
                 <w:sz w:val="20"/>
                 <w:szCs w:val="20"/>
               </w:rPr>
-              <w:t>[</w:t>
-            </w:r>
-            <w:r>
-              <w:rPr>
-                <w:rFonts w:ascii="Times New Roman" w:hAnsi="Times New Roman"/>
-                <w:sz w:val="16"/>
-                <w:szCs w:val="16"/>
-              </w:rPr>
-              <w:t>сумма_кол9</w:t>
-            </w:r>
-            <w:r>
-              <w:rPr>
-                <w:rFonts w:ascii="Times New Roman" w:hAnsi="Times New Roman"/>
-                <w:sz w:val="20"/>
-                <w:szCs w:val="20"/>
-              </w:rPr>
-              <w:t>]</w:t>
+              <w:t>[сумма_кол9]</w:t>
             </w:r>
           </w:p>
         </w:tc>
@@ -6700,23 +6178,7 @@
                 <w:sz w:val="20"/>
                 <w:szCs w:val="20"/>
               </w:rPr>
-              <w:t>[</w:t>
-            </w:r>
-            <w:r>
-              <w:rPr>
-                <w:rFonts w:ascii="Times New Roman" w:hAnsi="Times New Roman"/>
-                <w:sz w:val="16"/>
-                <w:szCs w:val="16"/>
-              </w:rPr>
-              <w:t>сумма_кол10</w:t>
-            </w:r>
-            <w:r>
-              <w:rPr>
-                <w:rFonts w:ascii="Times New Roman" w:hAnsi="Times New Roman"/>
-                <w:sz w:val="20"/>
-                <w:szCs w:val="20"/>
-              </w:rPr>
-              <w:t>]</w:t>
+              <w:t>[сумма_кол10]</w:t>
             </w:r>
           </w:p>
         </w:tc>
@@ -6788,8 +6250,8 @@
             <w:r>
               <w:rPr>
                 <w:rFonts w:ascii="Times New Roman" w:hAnsi="Times New Roman"/>
-                <w:sz w:val="16"/>
-                <w:szCs w:val="16"/>
+                <w:sz w:val="20"/>
+                <w:szCs w:val="20"/>
               </w:rPr>
               <w:t>код</w:t>
             </w:r>
@@ -6840,8 +6302,8 @@
             <w:r>
               <w:rPr>
                 <w:rFonts w:ascii="Times New Roman" w:hAnsi="Times New Roman"/>
-                <w:sz w:val="16"/>
-                <w:szCs w:val="16"/>
+                <w:sz w:val="20"/>
+                <w:szCs w:val="20"/>
               </w:rPr>
               <w:t>отход</w:t>
             </w:r>
@@ -6891,8 +6353,8 @@
             <w:r>
               <w:rPr>
                 <w:rFonts w:ascii="Times New Roman" w:hAnsi="Times New Roman"/>
-                <w:sz w:val="16"/>
-                <w:szCs w:val="16"/>
+                <w:sz w:val="20"/>
+                <w:szCs w:val="20"/>
               </w:rPr>
               <w:t>норматив</w:t>
             </w:r>
@@ -6942,8 +6404,8 @@
             <w:r>
               <w:rPr>
                 <w:rFonts w:ascii="Times New Roman" w:hAnsi="Times New Roman"/>
-                <w:sz w:val="16"/>
-                <w:szCs w:val="16"/>
+                <w:sz w:val="20"/>
+                <w:szCs w:val="20"/>
               </w:rPr>
               <w:t>количество</w:t>
             </w:r>
@@ -6993,8 +6455,8 @@
             <w:r>
               <w:rPr>
                 <w:rFonts w:ascii="Times New Roman" w:hAnsi="Times New Roman"/>
-                <w:sz w:val="16"/>
-                <w:szCs w:val="16"/>
+                <w:sz w:val="20"/>
+                <w:szCs w:val="20"/>
               </w:rPr>
               <w:t>кол_заготовка</w:t>
             </w:r>
@@ -7046,8 +6508,8 @@
             <w:r>
               <w:rPr>
                 <w:rFonts w:ascii="Times New Roman" w:hAnsi="Times New Roman"/>
-                <w:sz w:val="16"/>
-                <w:szCs w:val="16"/>
+                <w:sz w:val="20"/>
+                <w:szCs w:val="20"/>
               </w:rPr>
               <w:t>кол_сортировка</w:t>
             </w:r>
@@ -7098,8 +6560,8 @@
             <w:r>
               <w:rPr>
                 <w:rFonts w:ascii="Times New Roman" w:hAnsi="Times New Roman"/>
-                <w:sz w:val="16"/>
-                <w:szCs w:val="16"/>
+                <w:sz w:val="20"/>
+                <w:szCs w:val="20"/>
               </w:rPr>
               <w:t>кол_использование</w:t>
             </w:r>
@@ -7150,8 +6612,8 @@
             <w:r>
               <w:rPr>
                 <w:rFonts w:ascii="Times New Roman" w:hAnsi="Times New Roman"/>
-                <w:sz w:val="16"/>
-                <w:szCs w:val="16"/>
+                <w:sz w:val="20"/>
+                <w:szCs w:val="20"/>
               </w:rPr>
               <w:t>кол_обезвреживание</w:t>
             </w:r>
@@ -7202,8 +6664,8 @@
             <w:r>
               <w:rPr>
                 <w:rFonts w:ascii="Times New Roman" w:hAnsi="Times New Roman"/>
-                <w:sz w:val="16"/>
-                <w:szCs w:val="16"/>
+                <w:sz w:val="20"/>
+                <w:szCs w:val="20"/>
               </w:rPr>
               <w:t>кол_хранение</w:t>
             </w:r>
@@ -7254,8 +6716,8 @@
             <w:r>
               <w:rPr>
                 <w:rFonts w:ascii="Times New Roman" w:hAnsi="Times New Roman"/>
-                <w:sz w:val="16"/>
-                <w:szCs w:val="16"/>
+                <w:sz w:val="20"/>
+                <w:szCs w:val="20"/>
               </w:rPr>
               <w:t>кол_захоронение</w:t>
             </w:r>
@@ -7417,23 +6879,7 @@
                 <w:sz w:val="20"/>
                 <w:szCs w:val="20"/>
               </w:rPr>
-              <w:t>[</w:t>
-            </w:r>
-            <w:r>
-              <w:rPr>
-                <w:rFonts w:ascii="Times New Roman" w:hAnsi="Times New Roman"/>
-                <w:sz w:val="16"/>
-                <w:szCs w:val="16"/>
-              </w:rPr>
-              <w:t>сумма_кол4</w:t>
-            </w:r>
-            <w:r>
-              <w:rPr>
-                <w:rFonts w:ascii="Times New Roman" w:hAnsi="Times New Roman"/>
-                <w:sz w:val="20"/>
-                <w:szCs w:val="20"/>
-              </w:rPr>
-              <w:t>]</w:t>
+              <w:t>[сумма_кол4]</w:t>
             </w:r>
           </w:p>
         </w:tc>
@@ -7465,23 +6911,7 @@
                 <w:sz w:val="20"/>
                 <w:szCs w:val="20"/>
               </w:rPr>
-              <w:t>[</w:t>
-            </w:r>
-            <w:r>
-              <w:rPr>
-                <w:rFonts w:ascii="Times New Roman" w:hAnsi="Times New Roman"/>
-                <w:sz w:val="16"/>
-                <w:szCs w:val="16"/>
-              </w:rPr>
-              <w:t>сумма_кол5</w:t>
-            </w:r>
-            <w:r>
-              <w:rPr>
-                <w:rFonts w:ascii="Times New Roman" w:hAnsi="Times New Roman"/>
-                <w:sz w:val="20"/>
-                <w:szCs w:val="20"/>
-              </w:rPr>
-              <w:t>]</w:t>
+              <w:t>[сумма_кол5]</w:t>
             </w:r>
           </w:p>
         </w:tc>
@@ -7514,23 +6944,7 @@
                 <w:sz w:val="20"/>
                 <w:szCs w:val="20"/>
               </w:rPr>
-              <w:t>[</w:t>
-            </w:r>
-            <w:r>
-              <w:rPr>
-                <w:rFonts w:ascii="Times New Roman" w:hAnsi="Times New Roman"/>
-                <w:sz w:val="16"/>
-                <w:szCs w:val="16"/>
-              </w:rPr>
-              <w:t>сумма_кол6</w:t>
-            </w:r>
-            <w:r>
-              <w:rPr>
-                <w:rFonts w:ascii="Times New Roman" w:hAnsi="Times New Roman"/>
-                <w:sz w:val="20"/>
-                <w:szCs w:val="20"/>
-              </w:rPr>
-              <w:t>]</w:t>
+              <w:t>[сумма_кол6]</w:t>
             </w:r>
           </w:p>
         </w:tc>
@@ -7561,23 +6975,7 @@
                 <w:sz w:val="20"/>
                 <w:szCs w:val="20"/>
               </w:rPr>
-              <w:t>[</w:t>
-            </w:r>
-            <w:r>
-              <w:rPr>
-                <w:rFonts w:ascii="Times New Roman" w:hAnsi="Times New Roman"/>
-                <w:sz w:val="16"/>
-                <w:szCs w:val="16"/>
-              </w:rPr>
-              <w:t>сумма_кол7</w:t>
-            </w:r>
-            <w:r>
-              <w:rPr>
-                <w:rFonts w:ascii="Times New Roman" w:hAnsi="Times New Roman"/>
-                <w:sz w:val="20"/>
-                <w:szCs w:val="20"/>
-              </w:rPr>
-              <w:t>]</w:t>
+              <w:t>[сумма_кол7]</w:t>
             </w:r>
           </w:p>
         </w:tc>
@@ -7608,23 +7006,7 @@
                 <w:sz w:val="20"/>
                 <w:szCs w:val="20"/>
               </w:rPr>
-              <w:t>[</w:t>
-            </w:r>
-            <w:r>
-              <w:rPr>
-                <w:rFonts w:ascii="Times New Roman" w:hAnsi="Times New Roman"/>
-                <w:sz w:val="16"/>
-                <w:szCs w:val="16"/>
-              </w:rPr>
-              <w:t>сумма_кол8</w:t>
-            </w:r>
-            <w:r>
-              <w:rPr>
-                <w:rFonts w:ascii="Times New Roman" w:hAnsi="Times New Roman"/>
-                <w:sz w:val="20"/>
-                <w:szCs w:val="20"/>
-              </w:rPr>
-              <w:t>]</w:t>
+              <w:t>[сумма_кол8]</w:t>
             </w:r>
           </w:p>
         </w:tc>
@@ -7655,23 +7037,7 @@
                 <w:sz w:val="20"/>
                 <w:szCs w:val="20"/>
               </w:rPr>
-              <w:t>[</w:t>
-            </w:r>
-            <w:r>
-              <w:rPr>
-                <w:rFonts w:ascii="Times New Roman" w:hAnsi="Times New Roman"/>
-                <w:sz w:val="16"/>
-                <w:szCs w:val="16"/>
-              </w:rPr>
-              <w:t>сумма_кол9</w:t>
-            </w:r>
-            <w:r>
-              <w:rPr>
-                <w:rFonts w:ascii="Times New Roman" w:hAnsi="Times New Roman"/>
-                <w:sz w:val="20"/>
-                <w:szCs w:val="20"/>
-              </w:rPr>
-              <w:t>]</w:t>
+              <w:t>[сумма_кол9]</w:t>
             </w:r>
           </w:p>
         </w:tc>
@@ -7703,23 +7069,7 @@
                 <w:sz w:val="20"/>
                 <w:szCs w:val="20"/>
               </w:rPr>
-              <w:t>[</w:t>
-            </w:r>
-            <w:r>
-              <w:rPr>
-                <w:rFonts w:ascii="Times New Roman" w:hAnsi="Times New Roman"/>
-                <w:sz w:val="16"/>
-                <w:szCs w:val="16"/>
-              </w:rPr>
-              <w:t>сумма_кол10</w:t>
-            </w:r>
-            <w:r>
-              <w:rPr>
-                <w:rFonts w:ascii="Times New Roman" w:hAnsi="Times New Roman"/>
-                <w:sz w:val="20"/>
-                <w:szCs w:val="20"/>
-              </w:rPr>
-              <w:t>]</w:t>
+              <w:t>[сумма_кол10]</w:t>
             </w:r>
           </w:p>
         </w:tc>

</xml_diff>

<commit_message>
Local template adjustments (templates and package-lock)
</commit_message>
<xml_diff>
--- a/templates/docx/inventory_act/appendix_template.docx
+++ b/templates/docx/inventory_act/appendix_template.docx
@@ -166,63 +166,34 @@
               <w:spacing w:after="0" w:line="240" w:lineRule="auto"/>
               <w:rPr>
                 <w:rFonts w:ascii="Arial CYR" w:eastAsia="Times New Roman" w:hAnsi="Arial CYR" w:cs="Arial CYR"/>
-                <w:sz w:val="20"/>
-                <w:szCs w:val="20"/>
-                <w:lang w:eastAsia="ru-RU"/>
-              </w:rPr>
-            </w:pPr>
-            <w:r>
-              <w:rPr>
-                <w:rFonts w:ascii="Times New Roman" w:eastAsia="Times New Roman" w:hAnsi="Times New Roman"/>
-                <w:lang w:eastAsia="ru-RU"/>
-              </w:rPr>
-              <w:t>Приложение</w:t>
-            </w:r>
-            <w:r>
-              <w:rPr>
-                <w:rFonts w:ascii="Times New Roman" w:eastAsia="Times New Roman" w:hAnsi="Times New Roman"/>
-                <w:lang w:eastAsia="ru-RU"/>
-              </w:rPr>
-              <w:t xml:space="preserve"> </w:t>
-            </w:r>
-            <w:r>
-              <w:rPr>
-                <w:rFonts w:ascii="Times New Roman" w:eastAsia="Times New Roman" w:hAnsi="Times New Roman"/>
-                <w:sz w:val="20"/>
-                <w:szCs w:val="20"/>
-                <w:lang w:eastAsia="ru-RU"/>
-              </w:rPr>
-              <w:t>к акту инвент</w:t>
-            </w:r>
-            <w:r>
-              <w:rPr>
-                <w:rFonts w:ascii="Times New Roman" w:eastAsia="Times New Roman" w:hAnsi="Times New Roman"/>
-                <w:sz w:val="20"/>
-                <w:szCs w:val="20"/>
-                <w:lang w:eastAsia="ru-RU"/>
-              </w:rPr>
-              <w:t xml:space="preserve">аризации отходов производства </w:t>
-            </w:r>
-            <w:r>
+                <w:lang w:eastAsia="ru-RU"/>
+              </w:rPr>
+            </w:pPr>
+            <w:r>
+              <w:rPr>
+                <w:rFonts w:ascii="Times New Roman" w:eastAsia="Times New Roman" w:hAnsi="Times New Roman"/>
+                <w:lang w:eastAsia="ru-RU"/>
+              </w:rPr>
+              <w:t xml:space="preserve">Приложение к акту инвентаризации отходов производства </w:t>
+            </w:r>
+            <w:r>
+              <w:rPr>
+                <w:rFonts w:ascii="Times New Roman" w:hAnsi="Times New Roman"/>
+              </w:rPr>
               <w:t>[</w:t>
             </w:r>
             <w:proofErr w:type="spellStart"/>
             <w:r>
               <w:rPr>
-                <w:sz w:val="16"/>
-                <w:szCs w:val="16"/>
-              </w:rPr>
-              <w:t>д</w:t>
-            </w:r>
-            <w:r>
-              <w:rPr>
-                <w:sz w:val="16"/>
-                <w:szCs w:val="16"/>
-              </w:rPr>
-              <w:t>ата_акта</w:t>
+                <w:rFonts w:ascii="Times New Roman" w:hAnsi="Times New Roman"/>
+              </w:rPr>
+              <w:t>дата_акта</w:t>
             </w:r>
             <w:proofErr w:type="spellEnd"/>
             <w:r>
+              <w:rPr>
+                <w:rFonts w:ascii="Times New Roman" w:hAnsi="Times New Roman"/>
+              </w:rPr>
               <w:t>]</w:t>
             </w:r>
           </w:p>
@@ -415,7 +386,7 @@
             <w:tcBorders>
               <w:top w:val="nil"/>
               <w:left w:val="nil"/>
-              <w:bottom w:val="nil"/>
+              <w:bottom w:val="single" w:sz="4" w:space="0" w:color="auto"/>
               <w:right w:val="nil"/>
             </w:tcBorders>
             <w:noWrap/>
@@ -432,30 +403,33 @@
                 <w:sz w:val="24"/>
                 <w:szCs w:val="24"/>
                 <w:highlight w:val="yellow"/>
-                <w:u w:val="single"/>
-                <w:lang w:eastAsia="ru-RU"/>
-              </w:rPr>
-            </w:pPr>
-            <w:r>
+                <w:lang w:eastAsia="ru-RU"/>
+              </w:rPr>
+            </w:pPr>
+            <w:r>
+              <w:rPr>
+                <w:rFonts w:ascii="Times New Roman" w:hAnsi="Times New Roman"/>
+                <w:sz w:val="24"/>
+                <w:szCs w:val="24"/>
+              </w:rPr>
               <w:t>[</w:t>
             </w:r>
             <w:proofErr w:type="spellStart"/>
             <w:r>
               <w:rPr>
-                <w:sz w:val="16"/>
-                <w:szCs w:val="16"/>
-              </w:rPr>
-              <w:t>н</w:t>
-            </w:r>
-            <w:r>
-              <w:rPr>
-                <w:sz w:val="16"/>
-                <w:szCs w:val="16"/>
-              </w:rPr>
-              <w:t>азвание_организации</w:t>
+                <w:rFonts w:ascii="Times New Roman" w:hAnsi="Times New Roman"/>
+                <w:sz w:val="24"/>
+                <w:szCs w:val="24"/>
+              </w:rPr>
+              <w:t>название_организации</w:t>
             </w:r>
             <w:proofErr w:type="spellEnd"/>
             <w:r>
+              <w:rPr>
+                <w:rFonts w:ascii="Times New Roman" w:hAnsi="Times New Roman"/>
+                <w:sz w:val="24"/>
+                <w:szCs w:val="24"/>
+              </w:rPr>
               <w:t>]</w:t>
             </w:r>
           </w:p>
@@ -495,7 +469,7 @@
           <w:tcPr>
             <w:tcW w:w="821" w:type="dxa"/>
             <w:tcBorders>
-              <w:top w:val="nil"/>
+              <w:top w:val="single" w:sz="4" w:space="0" w:color="auto"/>
               <w:left w:val="nil"/>
               <w:bottom w:val="single" w:sz="8" w:space="0" w:color="auto"/>
               <w:right w:val="nil"/>
@@ -517,7 +491,7 @@
             <w:tcW w:w="14373" w:type="dxa"/>
             <w:gridSpan w:val="11"/>
             <w:tcBorders>
-              <w:top w:val="nil"/>
+              <w:top w:val="single" w:sz="4" w:space="0" w:color="auto"/>
               <w:left w:val="nil"/>
               <w:bottom w:val="single" w:sz="8" w:space="0" w:color="auto"/>
               <w:right w:val="nil"/>
@@ -531,12 +505,16 @@
               <w:jc w:val="center"/>
               <w:rPr>
                 <w:rFonts w:ascii="Times New Roman" w:eastAsia="Times New Roman" w:hAnsi="Times New Roman"/>
-                <w:lang w:eastAsia="ru-RU"/>
-              </w:rPr>
-            </w:pPr>
-            <w:r>
-              <w:rPr>
-                <w:rFonts w:ascii="Times New Roman" w:eastAsia="Times New Roman" w:hAnsi="Times New Roman"/>
+                <w:sz w:val="20"/>
+                <w:szCs w:val="20"/>
+                <w:lang w:eastAsia="ru-RU"/>
+              </w:rPr>
+            </w:pPr>
+            <w:r>
+              <w:rPr>
+                <w:rFonts w:ascii="Times New Roman" w:eastAsia="Times New Roman" w:hAnsi="Times New Roman"/>
+                <w:sz w:val="20"/>
+                <w:szCs w:val="20"/>
                 <w:lang w:eastAsia="ru-RU"/>
               </w:rPr>
               <w:t xml:space="preserve">(наименование </w:t>
@@ -544,12 +522,16 @@
             <w:r>
               <w:rPr>
                 <w:rFonts w:ascii="Times New Roman" w:hAnsi="Times New Roman"/>
+                <w:sz w:val="20"/>
+                <w:szCs w:val="20"/>
               </w:rPr>
               <w:t>юридического лица, фамилия, собственное имя, отчество (если таковое имеется) индивидуального предпринимателя</w:t>
             </w:r>
             <w:r>
               <w:rPr>
                 <w:rFonts w:ascii="Times New Roman" w:eastAsia="Times New Roman" w:hAnsi="Times New Roman"/>
+                <w:sz w:val="20"/>
+                <w:szCs w:val="20"/>
                 <w:lang w:eastAsia="ru-RU"/>
               </w:rPr>
               <w:t>)</w:t>
@@ -1601,8 +1583,8 @@
             <w:r>
               <w:rPr>
                 <w:rFonts w:ascii="Times New Roman" w:hAnsi="Times New Roman"/>
-                <w:sz w:val="16"/>
-                <w:szCs w:val="16"/>
+                <w:sz w:val="20"/>
+                <w:szCs w:val="20"/>
               </w:rPr>
               <w:t>код</w:t>
             </w:r>
@@ -1650,8 +1632,8 @@
             <w:r>
               <w:rPr>
                 <w:rFonts w:ascii="Times New Roman" w:hAnsi="Times New Roman"/>
-                <w:sz w:val="16"/>
-                <w:szCs w:val="16"/>
+                <w:sz w:val="20"/>
+                <w:szCs w:val="20"/>
               </w:rPr>
               <w:t>отход</w:t>
             </w:r>
@@ -1699,8 +1681,8 @@
             <w:r>
               <w:rPr>
                 <w:rFonts w:ascii="Times New Roman" w:hAnsi="Times New Roman"/>
-                <w:sz w:val="16"/>
-                <w:szCs w:val="16"/>
+                <w:sz w:val="20"/>
+                <w:szCs w:val="20"/>
               </w:rPr>
               <w:t>норматив</w:t>
             </w:r>
@@ -1748,8 +1730,8 @@
             <w:r>
               <w:rPr>
                 <w:rFonts w:ascii="Times New Roman" w:hAnsi="Times New Roman"/>
-                <w:sz w:val="16"/>
-                <w:szCs w:val="16"/>
+                <w:sz w:val="20"/>
+                <w:szCs w:val="20"/>
               </w:rPr>
               <w:t>количество</w:t>
             </w:r>
@@ -1798,8 +1780,8 @@
             <w:r>
               <w:rPr>
                 <w:rFonts w:ascii="Times New Roman" w:hAnsi="Times New Roman"/>
-                <w:sz w:val="16"/>
-                <w:szCs w:val="16"/>
+                <w:sz w:val="20"/>
+                <w:szCs w:val="20"/>
               </w:rPr>
               <w:t>кол_заготовка</w:t>
             </w:r>
@@ -1850,8 +1832,8 @@
             <w:r>
               <w:rPr>
                 <w:rFonts w:ascii="Times New Roman" w:hAnsi="Times New Roman"/>
-                <w:sz w:val="16"/>
-                <w:szCs w:val="16"/>
+                <w:sz w:val="20"/>
+                <w:szCs w:val="20"/>
               </w:rPr>
               <w:t>кол_сортировка</w:t>
             </w:r>
@@ -1901,8 +1883,8 @@
             <w:r>
               <w:rPr>
                 <w:rFonts w:ascii="Times New Roman" w:hAnsi="Times New Roman"/>
-                <w:sz w:val="16"/>
-                <w:szCs w:val="16"/>
+                <w:sz w:val="20"/>
+                <w:szCs w:val="20"/>
               </w:rPr>
               <w:t>кол_использование</w:t>
             </w:r>
@@ -1952,8 +1934,8 @@
             <w:r>
               <w:rPr>
                 <w:rFonts w:ascii="Times New Roman" w:hAnsi="Times New Roman"/>
-                <w:sz w:val="16"/>
-                <w:szCs w:val="16"/>
+                <w:sz w:val="20"/>
+                <w:szCs w:val="20"/>
               </w:rPr>
               <w:t>кол_обезвреживание</w:t>
             </w:r>
@@ -2003,8 +1985,8 @@
             <w:r>
               <w:rPr>
                 <w:rFonts w:ascii="Times New Roman" w:hAnsi="Times New Roman"/>
-                <w:sz w:val="16"/>
-                <w:szCs w:val="16"/>
+                <w:sz w:val="20"/>
+                <w:szCs w:val="20"/>
               </w:rPr>
               <w:t>кол_хранение</w:t>
             </w:r>
@@ -2053,8 +2035,8 @@
             <w:r>
               <w:rPr>
                 <w:rFonts w:ascii="Times New Roman" w:hAnsi="Times New Roman"/>
-                <w:sz w:val="16"/>
-                <w:szCs w:val="16"/>
+                <w:sz w:val="20"/>
+                <w:szCs w:val="20"/>
               </w:rPr>
               <w:t>кол_захоронение</w:t>
             </w:r>
@@ -2192,47 +2174,31 @@
                 <w:sz w:val="20"/>
                 <w:szCs w:val="20"/>
               </w:rPr>
-              <w:t>[</w:t>
-            </w:r>
-            <w:r>
-              <w:rPr>
-                <w:rFonts w:ascii="Times New Roman" w:hAnsi="Times New Roman"/>
-                <w:sz w:val="16"/>
-                <w:szCs w:val="16"/>
-              </w:rPr>
-              <w:t>сумма</w:t>
-            </w:r>
-            <w:r>
-              <w:rPr>
-                <w:rFonts w:ascii="Times New Roman" w:hAnsi="Times New Roman"/>
-                <w:sz w:val="16"/>
-                <w:szCs w:val="16"/>
+              <w:t>[сумма</w:t>
+            </w:r>
+            <w:r>
+              <w:rPr>
+                <w:rFonts w:ascii="Times New Roman" w:hAnsi="Times New Roman"/>
+                <w:sz w:val="20"/>
+                <w:szCs w:val="20"/>
               </w:rPr>
               <w:t>_</w:t>
             </w:r>
             <w:r>
               <w:rPr>
                 <w:rFonts w:ascii="Times New Roman" w:hAnsi="Times New Roman"/>
-                <w:sz w:val="16"/>
-                <w:szCs w:val="16"/>
+                <w:sz w:val="20"/>
+                <w:szCs w:val="20"/>
               </w:rPr>
               <w:t>кол</w:t>
             </w:r>
             <w:r>
               <w:rPr>
                 <w:rFonts w:ascii="Times New Roman" w:hAnsi="Times New Roman"/>
-                <w:sz w:val="16"/>
-                <w:szCs w:val="16"/>
-              </w:rPr>
-              <w:t>4</w:t>
-            </w:r>
-            <w:r>
-              <w:rPr>
-                <w:rFonts w:ascii="Times New Roman" w:hAnsi="Times New Roman"/>
-                <w:sz w:val="20"/>
-                <w:szCs w:val="20"/>
-              </w:rPr>
-              <w:t>]</w:t>
+                <w:sz w:val="20"/>
+                <w:szCs w:val="20"/>
+              </w:rPr>
+              <w:t>4]</w:t>
             </w:r>
           </w:p>
         </w:tc>
@@ -2266,31 +2232,7 @@
                 <w:sz w:val="20"/>
                 <w:szCs w:val="20"/>
               </w:rPr>
-              <w:t>[</w:t>
-            </w:r>
-            <w:r>
-              <w:rPr>
-                <w:rFonts w:ascii="Times New Roman" w:hAnsi="Times New Roman"/>
-                <w:sz w:val="16"/>
-                <w:szCs w:val="16"/>
-              </w:rPr>
-              <w:t>сумма_кол</w:t>
-            </w:r>
-            <w:r>
-              <w:rPr>
-                <w:rFonts w:ascii="Times New Roman" w:hAnsi="Times New Roman"/>
-                <w:sz w:val="16"/>
-                <w:szCs w:val="16"/>
-              </w:rPr>
-              <w:t>5</w:t>
-            </w:r>
-            <w:r>
-              <w:rPr>
-                <w:rFonts w:ascii="Times New Roman" w:hAnsi="Times New Roman"/>
-                <w:sz w:val="20"/>
-                <w:szCs w:val="20"/>
-              </w:rPr>
-              <w:t>]</w:t>
+              <w:t>[сумма_кол5]</w:t>
             </w:r>
           </w:p>
         </w:tc>
@@ -2325,31 +2267,7 @@
                 <w:sz w:val="20"/>
                 <w:szCs w:val="20"/>
               </w:rPr>
-              <w:t>[</w:t>
-            </w:r>
-            <w:r>
-              <w:rPr>
-                <w:rFonts w:ascii="Times New Roman" w:hAnsi="Times New Roman"/>
-                <w:sz w:val="16"/>
-                <w:szCs w:val="16"/>
-              </w:rPr>
-              <w:t>сумма_кол</w:t>
-            </w:r>
-            <w:r>
-              <w:rPr>
-                <w:rFonts w:ascii="Times New Roman" w:hAnsi="Times New Roman"/>
-                <w:sz w:val="16"/>
-                <w:szCs w:val="16"/>
-              </w:rPr>
-              <w:t>6</w:t>
-            </w:r>
-            <w:r>
-              <w:rPr>
-                <w:rFonts w:ascii="Times New Roman" w:hAnsi="Times New Roman"/>
-                <w:sz w:val="20"/>
-                <w:szCs w:val="20"/>
-              </w:rPr>
-              <w:t>]</w:t>
+              <w:t>[сумма_кол6]</w:t>
             </w:r>
           </w:p>
         </w:tc>
@@ -2383,31 +2301,7 @@
                 <w:sz w:val="20"/>
                 <w:szCs w:val="20"/>
               </w:rPr>
-              <w:t>[</w:t>
-            </w:r>
-            <w:r>
-              <w:rPr>
-                <w:rFonts w:ascii="Times New Roman" w:hAnsi="Times New Roman"/>
-                <w:sz w:val="16"/>
-                <w:szCs w:val="16"/>
-              </w:rPr>
-              <w:t>сумма_кол</w:t>
-            </w:r>
-            <w:r>
-              <w:rPr>
-                <w:rFonts w:ascii="Times New Roman" w:hAnsi="Times New Roman"/>
-                <w:sz w:val="16"/>
-                <w:szCs w:val="16"/>
-              </w:rPr>
-              <w:t>7</w:t>
-            </w:r>
-            <w:r>
-              <w:rPr>
-                <w:rFonts w:ascii="Times New Roman" w:hAnsi="Times New Roman"/>
-                <w:sz w:val="20"/>
-                <w:szCs w:val="20"/>
-              </w:rPr>
-              <w:t>]</w:t>
+              <w:t>[сумма_кол7]</w:t>
             </w:r>
           </w:p>
         </w:tc>
@@ -2440,31 +2334,7 @@
                 <w:sz w:val="20"/>
                 <w:szCs w:val="20"/>
               </w:rPr>
-              <w:t>[</w:t>
-            </w:r>
-            <w:r>
-              <w:rPr>
-                <w:rFonts w:ascii="Times New Roman" w:hAnsi="Times New Roman"/>
-                <w:sz w:val="16"/>
-                <w:szCs w:val="16"/>
-              </w:rPr>
-              <w:t>сумма_кол</w:t>
-            </w:r>
-            <w:r>
-              <w:rPr>
-                <w:rFonts w:ascii="Times New Roman" w:hAnsi="Times New Roman"/>
-                <w:sz w:val="16"/>
-                <w:szCs w:val="16"/>
-              </w:rPr>
-              <w:t>8</w:t>
-            </w:r>
-            <w:r>
-              <w:rPr>
-                <w:rFonts w:ascii="Times New Roman" w:hAnsi="Times New Roman"/>
-                <w:sz w:val="20"/>
-                <w:szCs w:val="20"/>
-              </w:rPr>
-              <w:t>]</w:t>
+              <w:t>[сумма_кол8]</w:t>
             </w:r>
           </w:p>
         </w:tc>
@@ -2498,31 +2368,7 @@
                 <w:sz w:val="20"/>
                 <w:szCs w:val="20"/>
               </w:rPr>
-              <w:t>[</w:t>
-            </w:r>
-            <w:r>
-              <w:rPr>
-                <w:rFonts w:ascii="Times New Roman" w:hAnsi="Times New Roman"/>
-                <w:sz w:val="16"/>
-                <w:szCs w:val="16"/>
-              </w:rPr>
-              <w:t>сумма_кол</w:t>
-            </w:r>
-            <w:r>
-              <w:rPr>
-                <w:rFonts w:ascii="Times New Roman" w:hAnsi="Times New Roman"/>
-                <w:sz w:val="16"/>
-                <w:szCs w:val="16"/>
-              </w:rPr>
-              <w:t>9</w:t>
-            </w:r>
-            <w:r>
-              <w:rPr>
-                <w:rFonts w:ascii="Times New Roman" w:hAnsi="Times New Roman"/>
-                <w:sz w:val="20"/>
-                <w:szCs w:val="20"/>
-              </w:rPr>
-              <w:t>]</w:t>
+              <w:t>[сумма_кол9]</w:t>
             </w:r>
           </w:p>
         </w:tc>
@@ -2555,31 +2401,7 @@
                 <w:sz w:val="20"/>
                 <w:szCs w:val="20"/>
               </w:rPr>
-              <w:t>[</w:t>
-            </w:r>
-            <w:r>
-              <w:rPr>
-                <w:rFonts w:ascii="Times New Roman" w:hAnsi="Times New Roman"/>
-                <w:sz w:val="16"/>
-                <w:szCs w:val="16"/>
-              </w:rPr>
-              <w:t>сумма_кол</w:t>
-            </w:r>
-            <w:r>
-              <w:rPr>
-                <w:rFonts w:ascii="Times New Roman" w:hAnsi="Times New Roman"/>
-                <w:sz w:val="16"/>
-                <w:szCs w:val="16"/>
-              </w:rPr>
-              <w:t>10</w:t>
-            </w:r>
-            <w:r>
-              <w:rPr>
-                <w:rFonts w:ascii="Times New Roman" w:hAnsi="Times New Roman"/>
-                <w:sz w:val="20"/>
-                <w:szCs w:val="20"/>
-              </w:rPr>
-              <w:t>]</w:t>
+              <w:t>[сумма_кол10]</w:t>
             </w:r>
           </w:p>
         </w:tc>
@@ -2928,8 +2750,8 @@
             <w:r>
               <w:rPr>
                 <w:rFonts w:ascii="Times New Roman" w:hAnsi="Times New Roman"/>
-                <w:sz w:val="16"/>
-                <w:szCs w:val="16"/>
+                <w:sz w:val="20"/>
+                <w:szCs w:val="20"/>
               </w:rPr>
               <w:t>код</w:t>
             </w:r>
@@ -2983,8 +2805,8 @@
             <w:r>
               <w:rPr>
                 <w:rFonts w:ascii="Times New Roman" w:hAnsi="Times New Roman"/>
-                <w:sz w:val="16"/>
-                <w:szCs w:val="16"/>
+                <w:sz w:val="20"/>
+                <w:szCs w:val="20"/>
               </w:rPr>
               <w:t>отход</w:t>
             </w:r>
@@ -3027,10 +2849,6 @@
               <w:t>[</w:t>
             </w:r>
             <w:r>
-              <w:rPr>
-                <w:sz w:val="16"/>
-                <w:szCs w:val="16"/>
-              </w:rPr>
               <w:t>норматив</w:t>
             </w:r>
             <w:r>
@@ -3074,8 +2892,8 @@
             <w:r>
               <w:rPr>
                 <w:rFonts w:ascii="Times New Roman" w:hAnsi="Times New Roman"/>
-                <w:sz w:val="16"/>
-                <w:szCs w:val="16"/>
+                <w:sz w:val="20"/>
+                <w:szCs w:val="20"/>
               </w:rPr>
               <w:t>количество</w:t>
             </w:r>
@@ -3127,8 +2945,8 @@
             <w:r>
               <w:rPr>
                 <w:rFonts w:ascii="Times New Roman" w:hAnsi="Times New Roman"/>
-                <w:sz w:val="16"/>
-                <w:szCs w:val="16"/>
+                <w:sz w:val="20"/>
+                <w:szCs w:val="20"/>
               </w:rPr>
               <w:t>кол_заготовка</w:t>
             </w:r>
@@ -3182,8 +3000,8 @@
             <w:r>
               <w:rPr>
                 <w:rFonts w:ascii="Times New Roman" w:hAnsi="Times New Roman"/>
-                <w:sz w:val="16"/>
-                <w:szCs w:val="16"/>
+                <w:sz w:val="20"/>
+                <w:szCs w:val="20"/>
               </w:rPr>
               <w:t>кол_сортировка</w:t>
             </w:r>
@@ -3233,8 +3051,8 @@
             <w:r>
               <w:rPr>
                 <w:rFonts w:ascii="Times New Roman" w:hAnsi="Times New Roman"/>
-                <w:sz w:val="16"/>
-                <w:szCs w:val="16"/>
+                <w:sz w:val="20"/>
+                <w:szCs w:val="20"/>
               </w:rPr>
               <w:t>кол_использование</w:t>
             </w:r>
@@ -3287,8 +3105,8 @@
             <w:r>
               <w:rPr>
                 <w:rFonts w:ascii="Times New Roman" w:hAnsi="Times New Roman"/>
-                <w:sz w:val="16"/>
-                <w:szCs w:val="16"/>
+                <w:sz w:val="20"/>
+                <w:szCs w:val="20"/>
               </w:rPr>
               <w:t>кол_обезвреживание</w:t>
             </w:r>
@@ -3341,8 +3159,8 @@
             <w:r>
               <w:rPr>
                 <w:rFonts w:ascii="Times New Roman" w:hAnsi="Times New Roman"/>
-                <w:sz w:val="16"/>
-                <w:szCs w:val="16"/>
+                <w:sz w:val="20"/>
+                <w:szCs w:val="20"/>
               </w:rPr>
               <w:t>кол_хранение</w:t>
             </w:r>
@@ -3391,8 +3209,8 @@
             <w:r>
               <w:rPr>
                 <w:rFonts w:ascii="Times New Roman" w:hAnsi="Times New Roman"/>
-                <w:sz w:val="16"/>
-                <w:szCs w:val="16"/>
+                <w:sz w:val="20"/>
+                <w:szCs w:val="20"/>
               </w:rPr>
               <w:t>кол_захоронение</w:t>
             </w:r>
@@ -3895,8 +3713,8 @@
             <w:r>
               <w:rPr>
                 <w:rFonts w:ascii="Times New Roman" w:hAnsi="Times New Roman"/>
-                <w:sz w:val="16"/>
-                <w:szCs w:val="16"/>
+                <w:sz w:val="20"/>
+                <w:szCs w:val="20"/>
               </w:rPr>
               <w:t>код</w:t>
             </w:r>
@@ -3944,8 +3762,8 @@
             <w:r>
               <w:rPr>
                 <w:rFonts w:ascii="Times New Roman" w:hAnsi="Times New Roman"/>
-                <w:sz w:val="16"/>
-                <w:szCs w:val="16"/>
+                <w:sz w:val="20"/>
+                <w:szCs w:val="20"/>
               </w:rPr>
               <w:t>отход</w:t>
             </w:r>
@@ -3993,8 +3811,8 @@
             <w:r>
               <w:rPr>
                 <w:rFonts w:ascii="Times New Roman" w:hAnsi="Times New Roman"/>
-                <w:sz w:val="16"/>
-                <w:szCs w:val="16"/>
+                <w:sz w:val="20"/>
+                <w:szCs w:val="20"/>
               </w:rPr>
               <w:t>норматив</w:t>
             </w:r>
@@ -4042,8 +3860,8 @@
             <w:r>
               <w:rPr>
                 <w:rFonts w:ascii="Times New Roman" w:hAnsi="Times New Roman"/>
-                <w:sz w:val="16"/>
-                <w:szCs w:val="16"/>
+                <w:sz w:val="20"/>
+                <w:szCs w:val="20"/>
               </w:rPr>
               <w:t>количество</w:t>
             </w:r>
@@ -4092,8 +3910,8 @@
             <w:r>
               <w:rPr>
                 <w:rFonts w:ascii="Times New Roman" w:hAnsi="Times New Roman"/>
-                <w:sz w:val="16"/>
-                <w:szCs w:val="16"/>
+                <w:sz w:val="20"/>
+                <w:szCs w:val="20"/>
               </w:rPr>
               <w:t>кол_заготовка</w:t>
             </w:r>
@@ -4144,8 +3962,8 @@
             <w:r>
               <w:rPr>
                 <w:rFonts w:ascii="Times New Roman" w:hAnsi="Times New Roman"/>
-                <w:sz w:val="16"/>
-                <w:szCs w:val="16"/>
+                <w:sz w:val="20"/>
+                <w:szCs w:val="20"/>
               </w:rPr>
               <w:t>кол_сортировка</w:t>
             </w:r>
@@ -4195,8 +4013,8 @@
             <w:r>
               <w:rPr>
                 <w:rFonts w:ascii="Times New Roman" w:hAnsi="Times New Roman"/>
-                <w:sz w:val="16"/>
-                <w:szCs w:val="16"/>
+                <w:sz w:val="20"/>
+                <w:szCs w:val="20"/>
               </w:rPr>
               <w:t>кол_использование</w:t>
             </w:r>
@@ -4246,8 +4064,8 @@
             <w:r>
               <w:rPr>
                 <w:rFonts w:ascii="Times New Roman" w:hAnsi="Times New Roman"/>
-                <w:sz w:val="16"/>
-                <w:szCs w:val="16"/>
+                <w:sz w:val="20"/>
+                <w:szCs w:val="20"/>
               </w:rPr>
               <w:t>кол_обезвреживание</w:t>
             </w:r>
@@ -4297,8 +4115,8 @@
             <w:r>
               <w:rPr>
                 <w:rFonts w:ascii="Times New Roman" w:hAnsi="Times New Roman"/>
-                <w:sz w:val="16"/>
-                <w:szCs w:val="16"/>
+                <w:sz w:val="20"/>
+                <w:szCs w:val="20"/>
               </w:rPr>
               <w:t>кол_хранение</w:t>
             </w:r>
@@ -4347,8 +4165,8 @@
             <w:r>
               <w:rPr>
                 <w:rFonts w:ascii="Times New Roman" w:hAnsi="Times New Roman"/>
-                <w:sz w:val="16"/>
-                <w:szCs w:val="16"/>
+                <w:sz w:val="20"/>
+                <w:szCs w:val="20"/>
               </w:rPr>
               <w:t>кол_захоронение</w:t>
             </w:r>
@@ -4487,23 +4305,7 @@
                 <w:sz w:val="20"/>
                 <w:szCs w:val="20"/>
               </w:rPr>
-              <w:t>[</w:t>
-            </w:r>
-            <w:r>
-              <w:rPr>
-                <w:rFonts w:ascii="Times New Roman" w:hAnsi="Times New Roman"/>
-                <w:sz w:val="16"/>
-                <w:szCs w:val="16"/>
-              </w:rPr>
-              <w:t>сумма_кол4</w:t>
-            </w:r>
-            <w:r>
-              <w:rPr>
-                <w:rFonts w:ascii="Times New Roman" w:hAnsi="Times New Roman"/>
-                <w:sz w:val="20"/>
-                <w:szCs w:val="20"/>
-              </w:rPr>
-              <w:t>]</w:t>
+              <w:t>[сумма_кол4]</w:t>
             </w:r>
           </w:p>
         </w:tc>
@@ -4537,23 +4339,7 @@
                 <w:sz w:val="20"/>
                 <w:szCs w:val="20"/>
               </w:rPr>
-              <w:t>[</w:t>
-            </w:r>
-            <w:r>
-              <w:rPr>
-                <w:rFonts w:ascii="Times New Roman" w:hAnsi="Times New Roman"/>
-                <w:sz w:val="16"/>
-                <w:szCs w:val="16"/>
-              </w:rPr>
-              <w:t>сумма_кол5</w:t>
-            </w:r>
-            <w:r>
-              <w:rPr>
-                <w:rFonts w:ascii="Times New Roman" w:hAnsi="Times New Roman"/>
-                <w:sz w:val="20"/>
-                <w:szCs w:val="20"/>
-              </w:rPr>
-              <w:t>]</w:t>
+              <w:t>[сумма_кол5]</w:t>
             </w:r>
           </w:p>
         </w:tc>
@@ -4588,23 +4374,7 @@
                 <w:sz w:val="20"/>
                 <w:szCs w:val="20"/>
               </w:rPr>
-              <w:t>[</w:t>
-            </w:r>
-            <w:r>
-              <w:rPr>
-                <w:rFonts w:ascii="Times New Roman" w:hAnsi="Times New Roman"/>
-                <w:sz w:val="16"/>
-                <w:szCs w:val="16"/>
-              </w:rPr>
-              <w:t>сумма_кол6</w:t>
-            </w:r>
-            <w:r>
-              <w:rPr>
-                <w:rFonts w:ascii="Times New Roman" w:hAnsi="Times New Roman"/>
-                <w:sz w:val="20"/>
-                <w:szCs w:val="20"/>
-              </w:rPr>
-              <w:t>]</w:t>
+              <w:t>[сумма_кол6]</w:t>
             </w:r>
           </w:p>
         </w:tc>
@@ -4637,23 +4407,7 @@
                 <w:sz w:val="20"/>
                 <w:szCs w:val="20"/>
               </w:rPr>
-              <w:t>[</w:t>
-            </w:r>
-            <w:r>
-              <w:rPr>
-                <w:rFonts w:ascii="Times New Roman" w:hAnsi="Times New Roman"/>
-                <w:sz w:val="16"/>
-                <w:szCs w:val="16"/>
-              </w:rPr>
-              <w:t>сумма_кол7</w:t>
-            </w:r>
-            <w:r>
-              <w:rPr>
-                <w:rFonts w:ascii="Times New Roman" w:hAnsi="Times New Roman"/>
-                <w:sz w:val="20"/>
-                <w:szCs w:val="20"/>
-              </w:rPr>
-              <w:t>]</w:t>
+              <w:t>[сумма_кол7]</w:t>
             </w:r>
           </w:p>
         </w:tc>
@@ -4684,23 +4438,7 @@
                 <w:sz w:val="20"/>
                 <w:szCs w:val="20"/>
               </w:rPr>
-              <w:t>[</w:t>
-            </w:r>
-            <w:r>
-              <w:rPr>
-                <w:rFonts w:ascii="Times New Roman" w:hAnsi="Times New Roman"/>
-                <w:sz w:val="16"/>
-                <w:szCs w:val="16"/>
-              </w:rPr>
-              <w:t>сумма_кол8</w:t>
-            </w:r>
-            <w:r>
-              <w:rPr>
-                <w:rFonts w:ascii="Times New Roman" w:hAnsi="Times New Roman"/>
-                <w:sz w:val="20"/>
-                <w:szCs w:val="20"/>
-              </w:rPr>
-              <w:t>]</w:t>
+              <w:t>[сумма_кол8]</w:t>
             </w:r>
           </w:p>
         </w:tc>
@@ -4732,23 +4470,7 @@
                 <w:sz w:val="20"/>
                 <w:szCs w:val="20"/>
               </w:rPr>
-              <w:t>[</w:t>
-            </w:r>
-            <w:r>
-              <w:rPr>
-                <w:rFonts w:ascii="Times New Roman" w:hAnsi="Times New Roman"/>
-                <w:sz w:val="16"/>
-                <w:szCs w:val="16"/>
-              </w:rPr>
-              <w:t>сумма_кол9</w:t>
-            </w:r>
-            <w:r>
-              <w:rPr>
-                <w:rFonts w:ascii="Times New Roman" w:hAnsi="Times New Roman"/>
-                <w:sz w:val="20"/>
-                <w:szCs w:val="20"/>
-              </w:rPr>
-              <w:t>]</w:t>
+              <w:t>[сумма_кол9]</w:t>
             </w:r>
           </w:p>
         </w:tc>
@@ -4780,23 +4502,7 @@
                 <w:sz w:val="20"/>
                 <w:szCs w:val="20"/>
               </w:rPr>
-              <w:t>[</w:t>
-            </w:r>
-            <w:r>
-              <w:rPr>
-                <w:rFonts w:ascii="Times New Roman" w:hAnsi="Times New Roman"/>
-                <w:sz w:val="16"/>
-                <w:szCs w:val="16"/>
-              </w:rPr>
-              <w:t>сумма_кол10</w:t>
-            </w:r>
-            <w:r>
-              <w:rPr>
-                <w:rFonts w:ascii="Times New Roman" w:hAnsi="Times New Roman"/>
-                <w:sz w:val="20"/>
-                <w:szCs w:val="20"/>
-              </w:rPr>
-              <w:t>]</w:t>
+              <w:t>[сумма_кол10]</w:t>
             </w:r>
           </w:p>
         </w:tc>
@@ -4865,8 +4571,8 @@
             <w:r>
               <w:rPr>
                 <w:rFonts w:ascii="Times New Roman" w:hAnsi="Times New Roman"/>
-                <w:sz w:val="16"/>
-                <w:szCs w:val="16"/>
+                <w:sz w:val="20"/>
+                <w:szCs w:val="20"/>
               </w:rPr>
               <w:t>код</w:t>
             </w:r>
@@ -4917,8 +4623,8 @@
             <w:r>
               <w:rPr>
                 <w:rFonts w:ascii="Times New Roman" w:hAnsi="Times New Roman"/>
-                <w:sz w:val="16"/>
-                <w:szCs w:val="16"/>
+                <w:sz w:val="20"/>
+                <w:szCs w:val="20"/>
               </w:rPr>
               <w:t>отход</w:t>
             </w:r>
@@ -4966,8 +4672,8 @@
             <w:r>
               <w:rPr>
                 <w:rFonts w:ascii="Times New Roman" w:hAnsi="Times New Roman"/>
-                <w:sz w:val="16"/>
-                <w:szCs w:val="16"/>
+                <w:sz w:val="20"/>
+                <w:szCs w:val="20"/>
               </w:rPr>
               <w:t>норматив</w:t>
             </w:r>
@@ -5015,8 +4721,8 @@
             <w:r>
               <w:rPr>
                 <w:rFonts w:ascii="Times New Roman" w:hAnsi="Times New Roman"/>
-                <w:sz w:val="16"/>
-                <w:szCs w:val="16"/>
+                <w:sz w:val="20"/>
+                <w:szCs w:val="20"/>
               </w:rPr>
               <w:t>количество</w:t>
             </w:r>
@@ -5065,8 +4771,8 @@
             <w:r>
               <w:rPr>
                 <w:rFonts w:ascii="Times New Roman" w:hAnsi="Times New Roman"/>
-                <w:sz w:val="16"/>
-                <w:szCs w:val="16"/>
+                <w:sz w:val="20"/>
+                <w:szCs w:val="20"/>
               </w:rPr>
               <w:t>кол_заготовка</w:t>
             </w:r>
@@ -5117,8 +4823,8 @@
             <w:r>
               <w:rPr>
                 <w:rFonts w:ascii="Times New Roman" w:hAnsi="Times New Roman"/>
-                <w:sz w:val="16"/>
-                <w:szCs w:val="16"/>
+                <w:sz w:val="20"/>
+                <w:szCs w:val="20"/>
               </w:rPr>
               <w:t>кол_сортировка</w:t>
             </w:r>
@@ -5168,8 +4874,8 @@
             <w:r>
               <w:rPr>
                 <w:rFonts w:ascii="Times New Roman" w:hAnsi="Times New Roman"/>
-                <w:sz w:val="16"/>
-                <w:szCs w:val="16"/>
+                <w:sz w:val="20"/>
+                <w:szCs w:val="20"/>
               </w:rPr>
               <w:t>кол_использование</w:t>
             </w:r>
@@ -5219,8 +4925,8 @@
             <w:r>
               <w:rPr>
                 <w:rFonts w:ascii="Times New Roman" w:hAnsi="Times New Roman"/>
-                <w:sz w:val="16"/>
-                <w:szCs w:val="16"/>
+                <w:sz w:val="20"/>
+                <w:szCs w:val="20"/>
               </w:rPr>
               <w:t>кол_обезвреживание</w:t>
             </w:r>
@@ -5270,8 +4976,8 @@
             <w:r>
               <w:rPr>
                 <w:rFonts w:ascii="Times New Roman" w:hAnsi="Times New Roman"/>
-                <w:sz w:val="16"/>
-                <w:szCs w:val="16"/>
+                <w:sz w:val="20"/>
+                <w:szCs w:val="20"/>
               </w:rPr>
               <w:t>кол_хранение</w:t>
             </w:r>
@@ -5320,8 +5026,8 @@
             <w:r>
               <w:rPr>
                 <w:rFonts w:ascii="Times New Roman" w:hAnsi="Times New Roman"/>
-                <w:sz w:val="16"/>
-                <w:szCs w:val="16"/>
+                <w:sz w:val="20"/>
+                <w:szCs w:val="20"/>
               </w:rPr>
               <w:t>кол_захоронение</w:t>
             </w:r>
@@ -5401,6 +5107,7 @@
                 <w:szCs w:val="20"/>
                 <w:lang w:eastAsia="ru-RU"/>
               </w:rPr>
+              <w:lastRenderedPageBreak/>
               <w:t>Итого отходов 4 класса опасности</w:t>
             </w:r>
           </w:p>
@@ -5463,23 +5170,7 @@
                 <w:sz w:val="20"/>
                 <w:szCs w:val="20"/>
               </w:rPr>
-              <w:t>[</w:t>
-            </w:r>
-            <w:r>
-              <w:rPr>
-                <w:rFonts w:ascii="Times New Roman" w:hAnsi="Times New Roman"/>
-                <w:sz w:val="16"/>
-                <w:szCs w:val="16"/>
-              </w:rPr>
-              <w:t>сумма_кол4</w:t>
-            </w:r>
-            <w:r>
-              <w:rPr>
-                <w:rFonts w:ascii="Times New Roman" w:hAnsi="Times New Roman"/>
-                <w:sz w:val="20"/>
-                <w:szCs w:val="20"/>
-              </w:rPr>
-              <w:t>]</w:t>
+              <w:t>[сумма_кол4]</w:t>
             </w:r>
           </w:p>
         </w:tc>
@@ -5513,23 +5204,7 @@
                 <w:sz w:val="20"/>
                 <w:szCs w:val="20"/>
               </w:rPr>
-              <w:t>[</w:t>
-            </w:r>
-            <w:r>
-              <w:rPr>
-                <w:rFonts w:ascii="Times New Roman" w:hAnsi="Times New Roman"/>
-                <w:sz w:val="16"/>
-                <w:szCs w:val="16"/>
-              </w:rPr>
-              <w:t>сумма_кол5</w:t>
-            </w:r>
-            <w:r>
-              <w:rPr>
-                <w:rFonts w:ascii="Times New Roman" w:hAnsi="Times New Roman"/>
-                <w:sz w:val="20"/>
-                <w:szCs w:val="20"/>
-              </w:rPr>
-              <w:t>]</w:t>
+              <w:t>[сумма_кол5]</w:t>
             </w:r>
           </w:p>
         </w:tc>
@@ -5564,23 +5239,7 @@
                 <w:sz w:val="20"/>
                 <w:szCs w:val="20"/>
               </w:rPr>
-              <w:t>[</w:t>
-            </w:r>
-            <w:r>
-              <w:rPr>
-                <w:rFonts w:ascii="Times New Roman" w:hAnsi="Times New Roman"/>
-                <w:sz w:val="16"/>
-                <w:szCs w:val="16"/>
-              </w:rPr>
-              <w:t>сумма_кол6</w:t>
-            </w:r>
-            <w:r>
-              <w:rPr>
-                <w:rFonts w:ascii="Times New Roman" w:hAnsi="Times New Roman"/>
-                <w:sz w:val="20"/>
-                <w:szCs w:val="20"/>
-              </w:rPr>
-              <w:t>]</w:t>
+              <w:t>[сумма_кол6]</w:t>
             </w:r>
           </w:p>
         </w:tc>
@@ -5614,23 +5273,7 @@
                 <w:sz w:val="20"/>
                 <w:szCs w:val="20"/>
               </w:rPr>
-              <w:t>[</w:t>
-            </w:r>
-            <w:r>
-              <w:rPr>
-                <w:rFonts w:ascii="Times New Roman" w:hAnsi="Times New Roman"/>
-                <w:sz w:val="16"/>
-                <w:szCs w:val="16"/>
-              </w:rPr>
-              <w:t>сумма_кол7</w:t>
-            </w:r>
-            <w:r>
-              <w:rPr>
-                <w:rFonts w:ascii="Times New Roman" w:hAnsi="Times New Roman"/>
-                <w:sz w:val="20"/>
-                <w:szCs w:val="20"/>
-              </w:rPr>
-              <w:t>]</w:t>
+              <w:t>[сумма_кол7]</w:t>
             </w:r>
           </w:p>
         </w:tc>
@@ -5661,23 +5304,7 @@
                 <w:sz w:val="20"/>
                 <w:szCs w:val="20"/>
               </w:rPr>
-              <w:t>[</w:t>
-            </w:r>
-            <w:r>
-              <w:rPr>
-                <w:rFonts w:ascii="Times New Roman" w:hAnsi="Times New Roman"/>
-                <w:sz w:val="16"/>
-                <w:szCs w:val="16"/>
-              </w:rPr>
-              <w:t>сумма_кол8</w:t>
-            </w:r>
-            <w:r>
-              <w:rPr>
-                <w:rFonts w:ascii="Times New Roman" w:hAnsi="Times New Roman"/>
-                <w:sz w:val="20"/>
-                <w:szCs w:val="20"/>
-              </w:rPr>
-              <w:t>]</w:t>
+              <w:t>[сумма_кол8]</w:t>
             </w:r>
           </w:p>
         </w:tc>
@@ -5711,23 +5338,7 @@
                 <w:sz w:val="20"/>
                 <w:szCs w:val="20"/>
               </w:rPr>
-              <w:t>[</w:t>
-            </w:r>
-            <w:r>
-              <w:rPr>
-                <w:rFonts w:ascii="Times New Roman" w:hAnsi="Times New Roman"/>
-                <w:sz w:val="16"/>
-                <w:szCs w:val="16"/>
-              </w:rPr>
-              <w:t>сумма_кол9</w:t>
-            </w:r>
-            <w:r>
-              <w:rPr>
-                <w:rFonts w:ascii="Times New Roman" w:hAnsi="Times New Roman"/>
-                <w:sz w:val="20"/>
-                <w:szCs w:val="20"/>
-              </w:rPr>
-              <w:t>]</w:t>
+              <w:t>[сумма_кол9]</w:t>
             </w:r>
           </w:p>
         </w:tc>
@@ -5759,23 +5370,7 @@
                 <w:sz w:val="20"/>
                 <w:szCs w:val="20"/>
               </w:rPr>
-              <w:t>[</w:t>
-            </w:r>
-            <w:r>
-              <w:rPr>
-                <w:rFonts w:ascii="Times New Roman" w:hAnsi="Times New Roman"/>
-                <w:sz w:val="16"/>
-                <w:szCs w:val="16"/>
-              </w:rPr>
-              <w:t>сумма_кол10</w:t>
-            </w:r>
-            <w:r>
-              <w:rPr>
-                <w:rFonts w:ascii="Times New Roman" w:hAnsi="Times New Roman"/>
-                <w:sz w:val="20"/>
-                <w:szCs w:val="20"/>
-              </w:rPr>
-              <w:t>]</w:t>
+              <w:t>[сумма_кол10]</w:t>
             </w:r>
           </w:p>
         </w:tc>
@@ -5820,8 +5415,8 @@
             <w:r>
               <w:rPr>
                 <w:rFonts w:ascii="Times New Roman" w:hAnsi="Times New Roman"/>
-                <w:sz w:val="16"/>
-                <w:szCs w:val="16"/>
+                <w:sz w:val="20"/>
+                <w:szCs w:val="20"/>
               </w:rPr>
               <w:t>код</w:t>
             </w:r>
@@ -5869,8 +5464,8 @@
             <w:r>
               <w:rPr>
                 <w:rFonts w:ascii="Times New Roman" w:hAnsi="Times New Roman"/>
-                <w:sz w:val="16"/>
-                <w:szCs w:val="16"/>
+                <w:sz w:val="20"/>
+                <w:szCs w:val="20"/>
               </w:rPr>
               <w:t>отход</w:t>
             </w:r>
@@ -5918,8 +5513,8 @@
             <w:r>
               <w:rPr>
                 <w:rFonts w:ascii="Times New Roman" w:hAnsi="Times New Roman"/>
-                <w:sz w:val="16"/>
-                <w:szCs w:val="16"/>
+                <w:sz w:val="20"/>
+                <w:szCs w:val="20"/>
               </w:rPr>
               <w:t>норматив</w:t>
             </w:r>
@@ -5967,8 +5562,8 @@
             <w:r>
               <w:rPr>
                 <w:rFonts w:ascii="Times New Roman" w:hAnsi="Times New Roman"/>
-                <w:sz w:val="16"/>
-                <w:szCs w:val="16"/>
+                <w:sz w:val="20"/>
+                <w:szCs w:val="20"/>
               </w:rPr>
               <w:t>количество</w:t>
             </w:r>
@@ -6017,19 +5612,10 @@
             <w:r>
               <w:rPr>
                 <w:rFonts w:ascii="Times New Roman" w:hAnsi="Times New Roman"/>
-                <w:sz w:val="16"/>
-                <w:szCs w:val="16"/>
-              </w:rPr>
-              <w:t>кол_заготов</w:t>
-            </w:r>
-            <w:r>
-              <w:rPr>
-                <w:rFonts w:ascii="Times New Roman" w:hAnsi="Times New Roman"/>
-                <w:sz w:val="16"/>
-                <w:szCs w:val="16"/>
-              </w:rPr>
-              <w:lastRenderedPageBreak/>
-              <w:t>ка</w:t>
+                <w:sz w:val="20"/>
+                <w:szCs w:val="20"/>
+              </w:rPr>
+              <w:t>кол_заготовка</w:t>
             </w:r>
             <w:proofErr w:type="spellEnd"/>
             <w:r>
@@ -6072,15 +5658,14 @@
                 <w:szCs w:val="20"/>
                 <w:lang w:val="en-US"/>
               </w:rPr>
-              <w:lastRenderedPageBreak/>
               <w:t>[</w:t>
             </w:r>
             <w:proofErr w:type="spellStart"/>
             <w:r>
               <w:rPr>
                 <w:rFonts w:ascii="Times New Roman" w:hAnsi="Times New Roman"/>
-                <w:sz w:val="16"/>
-                <w:szCs w:val="16"/>
+                <w:sz w:val="20"/>
+                <w:szCs w:val="20"/>
               </w:rPr>
               <w:t>кол_сортировка</w:t>
             </w:r>
@@ -6130,8 +5715,8 @@
             <w:r>
               <w:rPr>
                 <w:rFonts w:ascii="Times New Roman" w:hAnsi="Times New Roman"/>
-                <w:sz w:val="16"/>
-                <w:szCs w:val="16"/>
+                <w:sz w:val="20"/>
+                <w:szCs w:val="20"/>
               </w:rPr>
               <w:t>кол_использование</w:t>
             </w:r>
@@ -6181,19 +5766,10 @@
             <w:r>
               <w:rPr>
                 <w:rFonts w:ascii="Times New Roman" w:hAnsi="Times New Roman"/>
-                <w:sz w:val="16"/>
-                <w:szCs w:val="16"/>
-              </w:rPr>
-              <w:t>кол_обезврежи</w:t>
-            </w:r>
-            <w:r>
-              <w:rPr>
-                <w:rFonts w:ascii="Times New Roman" w:hAnsi="Times New Roman"/>
-                <w:sz w:val="16"/>
-                <w:szCs w:val="16"/>
-              </w:rPr>
-              <w:lastRenderedPageBreak/>
-              <w:t>вание</w:t>
+                <w:sz w:val="20"/>
+                <w:szCs w:val="20"/>
+              </w:rPr>
+              <w:t>кол_обезвреживание</w:t>
             </w:r>
             <w:proofErr w:type="spellEnd"/>
             <w:r>
@@ -6235,15 +5811,14 @@
                 <w:szCs w:val="20"/>
                 <w:lang w:val="en-US"/>
               </w:rPr>
-              <w:lastRenderedPageBreak/>
               <w:t>[</w:t>
             </w:r>
             <w:proofErr w:type="spellStart"/>
             <w:r>
               <w:rPr>
                 <w:rFonts w:ascii="Times New Roman" w:hAnsi="Times New Roman"/>
-                <w:sz w:val="16"/>
-                <w:szCs w:val="16"/>
+                <w:sz w:val="20"/>
+                <w:szCs w:val="20"/>
               </w:rPr>
               <w:t>кол_хранение</w:t>
             </w:r>
@@ -6293,8 +5868,8 @@
             <w:r>
               <w:rPr>
                 <w:rFonts w:ascii="Times New Roman" w:hAnsi="Times New Roman"/>
-                <w:sz w:val="16"/>
-                <w:szCs w:val="16"/>
+                <w:sz w:val="20"/>
+                <w:szCs w:val="20"/>
               </w:rPr>
               <w:t>кол_захоронение</w:t>
             </w:r>
@@ -6350,7 +5925,6 @@
                 <w:szCs w:val="20"/>
                 <w:lang w:eastAsia="ru-RU"/>
               </w:rPr>
-              <w:lastRenderedPageBreak/>
               <w:t>Итого неопасных отходов</w:t>
             </w:r>
           </w:p>
@@ -6412,23 +5986,7 @@
                 <w:sz w:val="20"/>
                 <w:szCs w:val="20"/>
               </w:rPr>
-              <w:t>[</w:t>
-            </w:r>
-            <w:r>
-              <w:rPr>
-                <w:rFonts w:ascii="Times New Roman" w:hAnsi="Times New Roman"/>
-                <w:sz w:val="16"/>
-                <w:szCs w:val="16"/>
-              </w:rPr>
-              <w:t>сумма_кол4</w:t>
-            </w:r>
-            <w:r>
-              <w:rPr>
-                <w:rFonts w:ascii="Times New Roman" w:hAnsi="Times New Roman"/>
-                <w:sz w:val="20"/>
-                <w:szCs w:val="20"/>
-              </w:rPr>
-              <w:t>]</w:t>
+              <w:t>[сумма_кол4]</w:t>
             </w:r>
           </w:p>
         </w:tc>
@@ -6461,23 +6019,7 @@
                 <w:sz w:val="20"/>
                 <w:szCs w:val="20"/>
               </w:rPr>
-              <w:t>[</w:t>
-            </w:r>
-            <w:r>
-              <w:rPr>
-                <w:rFonts w:ascii="Times New Roman" w:hAnsi="Times New Roman"/>
-                <w:sz w:val="16"/>
-                <w:szCs w:val="16"/>
-              </w:rPr>
-              <w:t>сумма_кол5</w:t>
-            </w:r>
-            <w:r>
-              <w:rPr>
-                <w:rFonts w:ascii="Times New Roman" w:hAnsi="Times New Roman"/>
-                <w:sz w:val="20"/>
-                <w:szCs w:val="20"/>
-              </w:rPr>
-              <w:t>]</w:t>
+              <w:t>[сумма_кол5]</w:t>
             </w:r>
           </w:p>
         </w:tc>
@@ -6511,23 +6053,7 @@
                 <w:sz w:val="20"/>
                 <w:szCs w:val="20"/>
               </w:rPr>
-              <w:t>[</w:t>
-            </w:r>
-            <w:r>
-              <w:rPr>
-                <w:rFonts w:ascii="Times New Roman" w:hAnsi="Times New Roman"/>
-                <w:sz w:val="16"/>
-                <w:szCs w:val="16"/>
-              </w:rPr>
-              <w:t>сумма_кол6</w:t>
-            </w:r>
-            <w:r>
-              <w:rPr>
-                <w:rFonts w:ascii="Times New Roman" w:hAnsi="Times New Roman"/>
-                <w:sz w:val="20"/>
-                <w:szCs w:val="20"/>
-              </w:rPr>
-              <w:t>]</w:t>
+              <w:t>[сумма_кол6]</w:t>
             </w:r>
           </w:p>
         </w:tc>
@@ -6558,23 +6084,7 @@
                 <w:sz w:val="20"/>
                 <w:szCs w:val="20"/>
               </w:rPr>
-              <w:t>[</w:t>
-            </w:r>
-            <w:r>
-              <w:rPr>
-                <w:rFonts w:ascii="Times New Roman" w:hAnsi="Times New Roman"/>
-                <w:sz w:val="16"/>
-                <w:szCs w:val="16"/>
-              </w:rPr>
-              <w:t>сумма_кол7</w:t>
-            </w:r>
-            <w:r>
-              <w:rPr>
-                <w:rFonts w:ascii="Times New Roman" w:hAnsi="Times New Roman"/>
-                <w:sz w:val="20"/>
-                <w:szCs w:val="20"/>
-              </w:rPr>
-              <w:t>]</w:t>
+              <w:t>[сумма_кол7]</w:t>
             </w:r>
           </w:p>
         </w:tc>
@@ -6605,23 +6115,7 @@
                 <w:sz w:val="20"/>
                 <w:szCs w:val="20"/>
               </w:rPr>
-              <w:t>[</w:t>
-            </w:r>
-            <w:r>
-              <w:rPr>
-                <w:rFonts w:ascii="Times New Roman" w:hAnsi="Times New Roman"/>
-                <w:sz w:val="16"/>
-                <w:szCs w:val="16"/>
-              </w:rPr>
-              <w:t>сумма_кол8</w:t>
-            </w:r>
-            <w:r>
-              <w:rPr>
-                <w:rFonts w:ascii="Times New Roman" w:hAnsi="Times New Roman"/>
-                <w:sz w:val="20"/>
-                <w:szCs w:val="20"/>
-              </w:rPr>
-              <w:t>]</w:t>
+              <w:t>[сумма_кол8]</w:t>
             </w:r>
           </w:p>
         </w:tc>
@@ -6652,23 +6146,7 @@
                 <w:sz w:val="20"/>
                 <w:szCs w:val="20"/>
               </w:rPr>
-              <w:t>[</w:t>
-            </w:r>
-            <w:r>
-              <w:rPr>
-                <w:rFonts w:ascii="Times New Roman" w:hAnsi="Times New Roman"/>
-                <w:sz w:val="16"/>
-                <w:szCs w:val="16"/>
-              </w:rPr>
-              <w:t>сумма_кол9</w:t>
-            </w:r>
-            <w:r>
-              <w:rPr>
-                <w:rFonts w:ascii="Times New Roman" w:hAnsi="Times New Roman"/>
-                <w:sz w:val="20"/>
-                <w:szCs w:val="20"/>
-              </w:rPr>
-              <w:t>]</w:t>
+              <w:t>[сумма_кол9]</w:t>
             </w:r>
           </w:p>
         </w:tc>
@@ -6700,23 +6178,7 @@
                 <w:sz w:val="20"/>
                 <w:szCs w:val="20"/>
               </w:rPr>
-              <w:t>[</w:t>
-            </w:r>
-            <w:r>
-              <w:rPr>
-                <w:rFonts w:ascii="Times New Roman" w:hAnsi="Times New Roman"/>
-                <w:sz w:val="16"/>
-                <w:szCs w:val="16"/>
-              </w:rPr>
-              <w:t>сумма_кол10</w:t>
-            </w:r>
-            <w:r>
-              <w:rPr>
-                <w:rFonts w:ascii="Times New Roman" w:hAnsi="Times New Roman"/>
-                <w:sz w:val="20"/>
-                <w:szCs w:val="20"/>
-              </w:rPr>
-              <w:t>]</w:t>
+              <w:t>[сумма_кол10]</w:t>
             </w:r>
           </w:p>
         </w:tc>
@@ -6788,8 +6250,8 @@
             <w:r>
               <w:rPr>
                 <w:rFonts w:ascii="Times New Roman" w:hAnsi="Times New Roman"/>
-                <w:sz w:val="16"/>
-                <w:szCs w:val="16"/>
+                <w:sz w:val="20"/>
+                <w:szCs w:val="20"/>
               </w:rPr>
               <w:t>код</w:t>
             </w:r>
@@ -6840,8 +6302,8 @@
             <w:r>
               <w:rPr>
                 <w:rFonts w:ascii="Times New Roman" w:hAnsi="Times New Roman"/>
-                <w:sz w:val="16"/>
-                <w:szCs w:val="16"/>
+                <w:sz w:val="20"/>
+                <w:szCs w:val="20"/>
               </w:rPr>
               <w:t>отход</w:t>
             </w:r>
@@ -6891,8 +6353,8 @@
             <w:r>
               <w:rPr>
                 <w:rFonts w:ascii="Times New Roman" w:hAnsi="Times New Roman"/>
-                <w:sz w:val="16"/>
-                <w:szCs w:val="16"/>
+                <w:sz w:val="20"/>
+                <w:szCs w:val="20"/>
               </w:rPr>
               <w:t>норматив</w:t>
             </w:r>
@@ -6942,8 +6404,8 @@
             <w:r>
               <w:rPr>
                 <w:rFonts w:ascii="Times New Roman" w:hAnsi="Times New Roman"/>
-                <w:sz w:val="16"/>
-                <w:szCs w:val="16"/>
+                <w:sz w:val="20"/>
+                <w:szCs w:val="20"/>
               </w:rPr>
               <w:t>количество</w:t>
             </w:r>
@@ -6993,8 +6455,8 @@
             <w:r>
               <w:rPr>
                 <w:rFonts w:ascii="Times New Roman" w:hAnsi="Times New Roman"/>
-                <w:sz w:val="16"/>
-                <w:szCs w:val="16"/>
+                <w:sz w:val="20"/>
+                <w:szCs w:val="20"/>
               </w:rPr>
               <w:t>кол_заготовка</w:t>
             </w:r>
@@ -7046,8 +6508,8 @@
             <w:r>
               <w:rPr>
                 <w:rFonts w:ascii="Times New Roman" w:hAnsi="Times New Roman"/>
-                <w:sz w:val="16"/>
-                <w:szCs w:val="16"/>
+                <w:sz w:val="20"/>
+                <w:szCs w:val="20"/>
               </w:rPr>
               <w:t>кол_сортировка</w:t>
             </w:r>
@@ -7098,8 +6560,8 @@
             <w:r>
               <w:rPr>
                 <w:rFonts w:ascii="Times New Roman" w:hAnsi="Times New Roman"/>
-                <w:sz w:val="16"/>
-                <w:szCs w:val="16"/>
+                <w:sz w:val="20"/>
+                <w:szCs w:val="20"/>
               </w:rPr>
               <w:t>кол_использование</w:t>
             </w:r>
@@ -7150,8 +6612,8 @@
             <w:r>
               <w:rPr>
                 <w:rFonts w:ascii="Times New Roman" w:hAnsi="Times New Roman"/>
-                <w:sz w:val="16"/>
-                <w:szCs w:val="16"/>
+                <w:sz w:val="20"/>
+                <w:szCs w:val="20"/>
               </w:rPr>
               <w:t>кол_обезвреживание</w:t>
             </w:r>
@@ -7202,8 +6664,8 @@
             <w:r>
               <w:rPr>
                 <w:rFonts w:ascii="Times New Roman" w:hAnsi="Times New Roman"/>
-                <w:sz w:val="16"/>
-                <w:szCs w:val="16"/>
+                <w:sz w:val="20"/>
+                <w:szCs w:val="20"/>
               </w:rPr>
               <w:t>кол_хранение</w:t>
             </w:r>
@@ -7254,8 +6716,8 @@
             <w:r>
               <w:rPr>
                 <w:rFonts w:ascii="Times New Roman" w:hAnsi="Times New Roman"/>
-                <w:sz w:val="16"/>
-                <w:szCs w:val="16"/>
+                <w:sz w:val="20"/>
+                <w:szCs w:val="20"/>
               </w:rPr>
               <w:t>кол_захоронение</w:t>
             </w:r>
@@ -7417,23 +6879,7 @@
                 <w:sz w:val="20"/>
                 <w:szCs w:val="20"/>
               </w:rPr>
-              <w:t>[</w:t>
-            </w:r>
-            <w:r>
-              <w:rPr>
-                <w:rFonts w:ascii="Times New Roman" w:hAnsi="Times New Roman"/>
-                <w:sz w:val="16"/>
-                <w:szCs w:val="16"/>
-              </w:rPr>
-              <w:t>сумма_кол4</w:t>
-            </w:r>
-            <w:r>
-              <w:rPr>
-                <w:rFonts w:ascii="Times New Roman" w:hAnsi="Times New Roman"/>
-                <w:sz w:val="20"/>
-                <w:szCs w:val="20"/>
-              </w:rPr>
-              <w:t>]</w:t>
+              <w:t>[сумма_кол4]</w:t>
             </w:r>
           </w:p>
         </w:tc>
@@ -7465,23 +6911,7 @@
                 <w:sz w:val="20"/>
                 <w:szCs w:val="20"/>
               </w:rPr>
-              <w:t>[</w:t>
-            </w:r>
-            <w:r>
-              <w:rPr>
-                <w:rFonts w:ascii="Times New Roman" w:hAnsi="Times New Roman"/>
-                <w:sz w:val="16"/>
-                <w:szCs w:val="16"/>
-              </w:rPr>
-              <w:t>сумма_кол5</w:t>
-            </w:r>
-            <w:r>
-              <w:rPr>
-                <w:rFonts w:ascii="Times New Roman" w:hAnsi="Times New Roman"/>
-                <w:sz w:val="20"/>
-                <w:szCs w:val="20"/>
-              </w:rPr>
-              <w:t>]</w:t>
+              <w:t>[сумма_кол5]</w:t>
             </w:r>
           </w:p>
         </w:tc>
@@ -7514,23 +6944,7 @@
                 <w:sz w:val="20"/>
                 <w:szCs w:val="20"/>
               </w:rPr>
-              <w:t>[</w:t>
-            </w:r>
-            <w:r>
-              <w:rPr>
-                <w:rFonts w:ascii="Times New Roman" w:hAnsi="Times New Roman"/>
-                <w:sz w:val="16"/>
-                <w:szCs w:val="16"/>
-              </w:rPr>
-              <w:t>сумма_кол6</w:t>
-            </w:r>
-            <w:r>
-              <w:rPr>
-                <w:rFonts w:ascii="Times New Roman" w:hAnsi="Times New Roman"/>
-                <w:sz w:val="20"/>
-                <w:szCs w:val="20"/>
-              </w:rPr>
-              <w:t>]</w:t>
+              <w:t>[сумма_кол6]</w:t>
             </w:r>
           </w:p>
         </w:tc>
@@ -7561,23 +6975,7 @@
                 <w:sz w:val="20"/>
                 <w:szCs w:val="20"/>
               </w:rPr>
-              <w:t>[</w:t>
-            </w:r>
-            <w:r>
-              <w:rPr>
-                <w:rFonts w:ascii="Times New Roman" w:hAnsi="Times New Roman"/>
-                <w:sz w:val="16"/>
-                <w:szCs w:val="16"/>
-              </w:rPr>
-              <w:t>сумма_кол7</w:t>
-            </w:r>
-            <w:r>
-              <w:rPr>
-                <w:rFonts w:ascii="Times New Roman" w:hAnsi="Times New Roman"/>
-                <w:sz w:val="20"/>
-                <w:szCs w:val="20"/>
-              </w:rPr>
-              <w:t>]</w:t>
+              <w:t>[сумма_кол7]</w:t>
             </w:r>
           </w:p>
         </w:tc>
@@ -7608,23 +7006,7 @@
                 <w:sz w:val="20"/>
                 <w:szCs w:val="20"/>
               </w:rPr>
-              <w:t>[</w:t>
-            </w:r>
-            <w:r>
-              <w:rPr>
-                <w:rFonts w:ascii="Times New Roman" w:hAnsi="Times New Roman"/>
-                <w:sz w:val="16"/>
-                <w:szCs w:val="16"/>
-              </w:rPr>
-              <w:t>сумма_кол8</w:t>
-            </w:r>
-            <w:r>
-              <w:rPr>
-                <w:rFonts w:ascii="Times New Roman" w:hAnsi="Times New Roman"/>
-                <w:sz w:val="20"/>
-                <w:szCs w:val="20"/>
-              </w:rPr>
-              <w:t>]</w:t>
+              <w:t>[сумма_кол8]</w:t>
             </w:r>
           </w:p>
         </w:tc>
@@ -7655,23 +7037,7 @@
                 <w:sz w:val="20"/>
                 <w:szCs w:val="20"/>
               </w:rPr>
-              <w:t>[</w:t>
-            </w:r>
-            <w:r>
-              <w:rPr>
-                <w:rFonts w:ascii="Times New Roman" w:hAnsi="Times New Roman"/>
-                <w:sz w:val="16"/>
-                <w:szCs w:val="16"/>
-              </w:rPr>
-              <w:t>сумма_кол9</w:t>
-            </w:r>
-            <w:r>
-              <w:rPr>
-                <w:rFonts w:ascii="Times New Roman" w:hAnsi="Times New Roman"/>
-                <w:sz w:val="20"/>
-                <w:szCs w:val="20"/>
-              </w:rPr>
-              <w:t>]</w:t>
+              <w:t>[сумма_кол9]</w:t>
             </w:r>
           </w:p>
         </w:tc>
@@ -7703,23 +7069,7 @@
                 <w:sz w:val="20"/>
                 <w:szCs w:val="20"/>
               </w:rPr>
-              <w:t>[</w:t>
-            </w:r>
-            <w:r>
-              <w:rPr>
-                <w:rFonts w:ascii="Times New Roman" w:hAnsi="Times New Roman"/>
-                <w:sz w:val="16"/>
-                <w:szCs w:val="16"/>
-              </w:rPr>
-              <w:t>сумма_кол10</w:t>
-            </w:r>
-            <w:r>
-              <w:rPr>
-                <w:rFonts w:ascii="Times New Roman" w:hAnsi="Times New Roman"/>
-                <w:sz w:val="20"/>
-                <w:szCs w:val="20"/>
-              </w:rPr>
-              <w:t>]</w:t>
+              <w:t>[сумма_кол10]</w:t>
             </w:r>
           </w:p>
         </w:tc>

</xml_diff>

<commit_message>
feat: generation choice with ZIP archive, full org name, DOCX underlining and multiline composition
</commit_message>
<xml_diff>
--- a/templates/docx/inventory_act/appendix_template.docx
+++ b/templates/docx/inventory_act/appendix_template.docx
@@ -175,6 +175,13 @@
                 <w:lang w:eastAsia="ru-RU"/>
               </w:rPr>
               <w:t xml:space="preserve">Приложение к акту инвентаризации отходов производства </w:t>
+            </w:r>
+            <w:r>
+              <w:rPr>
+                <w:rFonts w:ascii="Times New Roman" w:eastAsia="Times New Roman" w:hAnsi="Times New Roman"/>
+                <w:lang w:eastAsia="ru-RU"/>
+              </w:rPr>
+              <w:t xml:space="preserve">от </w:t>
             </w:r>
             <w:r>
               <w:rPr>

</xml_diff>